<commit_message>
docs: Adjuntar evidencia f3-apt7-e2 corregido.
</commit_message>
<xml_diff>
--- a/Fase 3. Ejecución/Evidencias Guía 7 - AP7/02. GA7-220601501-AA1-EV01/docx/GA7-220601501-AA1-EV01.docx
+++ b/Fase 3. Ejecución/Evidencias Guía 7 - AP7/02. GA7-220601501-AA1-EV01/docx/GA7-220601501-AA1-EV01.docx
@@ -2,176 +2,366 @@
 <file path=word/document.xml><?xml version="1.0" encoding="utf-8"?>
 <w:document xmlns:wpc="http://schemas.microsoft.com/office/word/2010/wordprocessingCanvas" xmlns:cx="http://schemas.microsoft.com/office/drawing/2014/chartex" xmlns:cx1="http://schemas.microsoft.com/office/drawing/2015/9/8/chartex" xmlns:cx2="http://schemas.microsoft.com/office/drawing/2015/10/21/chartex" xmlns:cx3="http://schemas.microsoft.com/office/drawing/2016/5/9/chartex" xmlns:cx4="http://schemas.microsoft.com/office/drawing/2016/5/10/chartex" xmlns:cx5="http://schemas.microsoft.com/office/drawing/2016/5/11/chartex" xmlns:cx6="http://schemas.microsoft.com/office/drawing/2016/5/12/chartex" xmlns:cx7="http://schemas.microsoft.com/office/drawing/2016/5/13/chartex" xmlns:cx8="http://schemas.microsoft.com/office/drawing/2016/5/14/chartex" xmlns:mc="http://schemas.openxmlformats.org/markup-compatibility/2006" xmlns:aink="http://schemas.microsoft.com/office/drawing/2016/ink" xmlns:am3d="http://schemas.microsoft.com/office/drawing/2017/model3d" xmlns:o="urn:schemas-microsoft-com:office:office" xmlns:oel="http://schemas.microsoft.com/office/2019/extlst" xmlns:r="http://schemas.openxmlformats.org/officeDocument/2006/relationships" xmlns:m="http://schemas.openxmlformats.org/officeDocument/2006/math" xmlns:v="urn:schemas-microsoft-com:vml" xmlns:wp14="http://schemas.microsoft.com/office/word/2010/wordprocessingDrawing" xmlns:wp="http://schemas.openxmlformats.org/drawingml/2006/wordprocessingDrawing" xmlns:w10="urn:schemas-microsoft-com:office:word" xmlns:w="http://schemas.openxmlformats.org/wordprocessingml/2006/main" xmlns:w14="http://schemas.microsoft.com/office/word/2010/wordml" xmlns:w15="http://schemas.microsoft.com/office/word/2012/wordml" xmlns:w16cex="http://schemas.microsoft.com/office/word/2018/wordml/cex" xmlns:w16cid="http://schemas.microsoft.com/office/word/2016/wordml/cid" xmlns:w16="http://schemas.microsoft.com/office/word/2018/wordml" xmlns:w16du="http://schemas.microsoft.com/office/word/2023/wordml/word16du" xmlns:w16sdtdh="http://schemas.microsoft.com/office/word/2020/wordml/sdtdatahash" xmlns:w16sdtfl="http://schemas.microsoft.com/office/word/2024/wordml/sdtformatlock" xmlns:w16se="http://schemas.microsoft.com/office/word/2015/wordml/symex" xmlns:wpg="http://schemas.microsoft.com/office/word/2010/wordprocessingGroup" xmlns:wpi="http://schemas.microsoft.com/office/word/2010/wordprocessingInk" xmlns:wne="http://schemas.microsoft.com/office/word/2006/wordml" xmlns:wps="http://schemas.microsoft.com/office/word/2010/wordprocessingShape" mc:Ignorable="w14 w15 w16se w16cid w16 w16cex w16sdtdh w16sdtfl w16du wp14">
   <w:body>
-    <w:p/>
-    <w:p/>
-    <w:p/>
-    <w:p/>
+    <w:p>
+      <w:pPr>
+        <w:rPr>
+          <w:rFonts w:ascii="Times New Roman" w:hAnsi="Times New Roman" w:cs="Times New Roman"/>
+          <w:color w:val="000000" w:themeColor="text1"/>
+        </w:rPr>
+      </w:pPr>
+    </w:p>
+    <w:p>
+      <w:pPr>
+        <w:rPr>
+          <w:rFonts w:ascii="Times New Roman" w:hAnsi="Times New Roman" w:cs="Times New Roman"/>
+          <w:color w:val="000000" w:themeColor="text1"/>
+        </w:rPr>
+      </w:pPr>
+    </w:p>
+    <w:p>
+      <w:pPr>
+        <w:rPr>
+          <w:rFonts w:ascii="Times New Roman" w:hAnsi="Times New Roman" w:cs="Times New Roman"/>
+          <w:color w:val="000000" w:themeColor="text1"/>
+        </w:rPr>
+      </w:pPr>
+    </w:p>
+    <w:p>
+      <w:pPr>
+        <w:rPr>
+          <w:rFonts w:ascii="Times New Roman" w:hAnsi="Times New Roman" w:cs="Times New Roman"/>
+          <w:color w:val="000000" w:themeColor="text1"/>
+        </w:rPr>
+      </w:pPr>
+    </w:p>
+    <w:p>
+      <w:pPr>
+        <w:rPr>
+          <w:rFonts w:ascii="Times New Roman" w:hAnsi="Times New Roman" w:cs="Times New Roman"/>
+          <w:color w:val="000000" w:themeColor="text1"/>
+        </w:rPr>
+      </w:pPr>
+    </w:p>
     <w:p>
       <w:pPr>
         <w:pStyle w:val="Ttulo1"/>
         <w:jc w:val="center"/>
         <w:rPr>
-          <w:b/>
-          <w:bCs/>
-        </w:rPr>
-      </w:pPr>
-      <w:r>
-        <w:rPr>
-          <w:b/>
-          <w:bCs/>
+          <w:rFonts w:ascii="Times New Roman" w:hAnsi="Times New Roman" w:cs="Times New Roman"/>
+          <w:b/>
+          <w:bCs/>
+          <w:color w:val="000000" w:themeColor="text1"/>
+        </w:rPr>
+      </w:pPr>
+      <w:r>
+        <w:rPr>
+          <w:rFonts w:ascii="Times New Roman" w:hAnsi="Times New Roman" w:cs="Times New Roman"/>
+          <w:b/>
+          <w:bCs/>
+          <w:color w:val="000000" w:themeColor="text1"/>
         </w:rPr>
         <w:t>ANÁLISIS DE CASO DE SITUACIONES EN EL CONTEXTO AMBIENTAL Y SST</w:t>
       </w:r>
     </w:p>
-    <w:p/>
+    <w:p>
+      <w:pPr>
+        <w:rPr>
+          <w:rFonts w:ascii="Times New Roman" w:hAnsi="Times New Roman" w:cs="Times New Roman"/>
+          <w:color w:val="000000" w:themeColor="text1"/>
+        </w:rPr>
+      </w:pPr>
+    </w:p>
     <w:p>
       <w:pPr>
         <w:jc w:val="center"/>
-      </w:pPr>
-      <w:r>
-        <w:rPr>
-          <w:b/>
-          <w:bCs/>
+        <w:rPr>
+          <w:rFonts w:ascii="Times New Roman" w:hAnsi="Times New Roman" w:cs="Times New Roman"/>
+          <w:color w:val="000000" w:themeColor="text1"/>
+        </w:rPr>
+      </w:pPr>
+      <w:r>
+        <w:rPr>
+          <w:rFonts w:ascii="Times New Roman" w:hAnsi="Times New Roman" w:cs="Times New Roman"/>
+          <w:b/>
+          <w:bCs/>
+          <w:color w:val="000000" w:themeColor="text1"/>
         </w:rPr>
         <w:t>Programa de formación</w:t>
       </w:r>
       <w:r>
         <w:rPr>
-          <w:b/>
-          <w:bCs/>
+          <w:rFonts w:ascii="Times New Roman" w:hAnsi="Times New Roman" w:cs="Times New Roman"/>
+          <w:b/>
+          <w:bCs/>
+          <w:color w:val="000000" w:themeColor="text1"/>
         </w:rPr>
         <w:br/>
       </w:r>
       <w:r>
+        <w:rPr>
+          <w:rFonts w:ascii="Times New Roman" w:hAnsi="Times New Roman" w:cs="Times New Roman"/>
+          <w:color w:val="000000" w:themeColor="text1"/>
+        </w:rPr>
         <w:t>Análisis y Desarrollo de Software</w:t>
       </w:r>
     </w:p>
     <w:p>
       <w:pPr>
         <w:jc w:val="center"/>
+        <w:rPr>
+          <w:rFonts w:ascii="Times New Roman" w:hAnsi="Times New Roman" w:cs="Times New Roman"/>
+          <w:color w:val="000000" w:themeColor="text1"/>
+        </w:rPr>
       </w:pPr>
     </w:p>
     <w:p>
       <w:pPr>
         <w:jc w:val="center"/>
-      </w:pPr>
-      <w:r>
-        <w:rPr>
-          <w:b/>
-          <w:bCs/>
+        <w:rPr>
+          <w:rFonts w:ascii="Times New Roman" w:hAnsi="Times New Roman" w:cs="Times New Roman"/>
+          <w:color w:val="000000" w:themeColor="text1"/>
+        </w:rPr>
+      </w:pPr>
+      <w:r>
+        <w:rPr>
+          <w:rFonts w:ascii="Times New Roman" w:hAnsi="Times New Roman" w:cs="Times New Roman"/>
+          <w:b/>
+          <w:bCs/>
+          <w:color w:val="000000" w:themeColor="text1"/>
         </w:rPr>
         <w:t>Fase del proyecto</w:t>
       </w:r>
       <w:r>
         <w:rPr>
-          <w:b/>
-          <w:bCs/>
+          <w:rFonts w:ascii="Times New Roman" w:hAnsi="Times New Roman" w:cs="Times New Roman"/>
+          <w:b/>
+          <w:bCs/>
+          <w:color w:val="000000" w:themeColor="text1"/>
         </w:rPr>
         <w:br/>
       </w:r>
       <w:r>
+        <w:rPr>
+          <w:rFonts w:ascii="Times New Roman" w:hAnsi="Times New Roman" w:cs="Times New Roman"/>
+          <w:color w:val="000000" w:themeColor="text1"/>
+        </w:rPr>
         <w:t>Ejecución</w:t>
       </w:r>
     </w:p>
     <w:p>
       <w:pPr>
         <w:jc w:val="center"/>
+        <w:rPr>
+          <w:rFonts w:ascii="Times New Roman" w:hAnsi="Times New Roman" w:cs="Times New Roman"/>
+          <w:color w:val="000000" w:themeColor="text1"/>
+        </w:rPr>
       </w:pPr>
     </w:p>
     <w:p>
       <w:pPr>
         <w:jc w:val="center"/>
-      </w:pPr>
-      <w:r>
-        <w:rPr>
-          <w:b/>
-          <w:bCs/>
+        <w:rPr>
+          <w:rFonts w:ascii="Times New Roman" w:hAnsi="Times New Roman" w:cs="Times New Roman"/>
+          <w:color w:val="000000" w:themeColor="text1"/>
+        </w:rPr>
+      </w:pPr>
+      <w:r>
+        <w:rPr>
+          <w:rFonts w:ascii="Times New Roman" w:hAnsi="Times New Roman" w:cs="Times New Roman"/>
+          <w:b/>
+          <w:bCs/>
+          <w:color w:val="000000" w:themeColor="text1"/>
         </w:rPr>
         <w:t>Evidencia</w:t>
       </w:r>
       <w:r>
         <w:rPr>
-          <w:b/>
-          <w:bCs/>
+          <w:rFonts w:ascii="Times New Roman" w:hAnsi="Times New Roman" w:cs="Times New Roman"/>
+          <w:b/>
+          <w:bCs/>
+          <w:color w:val="000000" w:themeColor="text1"/>
         </w:rPr>
         <w:br/>
       </w:r>
       <w:r>
+        <w:rPr>
+          <w:rFonts w:ascii="Times New Roman" w:hAnsi="Times New Roman" w:cs="Times New Roman"/>
+          <w:color w:val="000000" w:themeColor="text1"/>
+        </w:rPr>
         <w:t>Análisis de caso de situaciones que se presentan en el contexto ambiental y del SST</w:t>
       </w:r>
       <w:r>
+        <w:rPr>
+          <w:rFonts w:ascii="Times New Roman" w:hAnsi="Times New Roman" w:cs="Times New Roman"/>
+          <w:color w:val="000000" w:themeColor="text1"/>
+        </w:rPr>
         <w:t xml:space="preserve"> </w:t>
       </w:r>
       <w:r>
+        <w:rPr>
+          <w:rFonts w:ascii="Times New Roman" w:hAnsi="Times New Roman" w:cs="Times New Roman"/>
+          <w:color w:val="000000" w:themeColor="text1"/>
+        </w:rPr>
         <w:t xml:space="preserve"> (GA7-220601501-AA1-EV01)</w:t>
       </w:r>
     </w:p>
     <w:p>
       <w:pPr>
         <w:jc w:val="center"/>
+        <w:rPr>
+          <w:rFonts w:ascii="Times New Roman" w:hAnsi="Times New Roman" w:cs="Times New Roman"/>
+          <w:color w:val="000000" w:themeColor="text1"/>
+        </w:rPr>
       </w:pPr>
     </w:p>
     <w:p>
       <w:pPr>
         <w:jc w:val="center"/>
-      </w:pPr>
-      <w:r>
-        <w:rPr>
-          <w:b/>
-          <w:bCs/>
+        <w:rPr>
+          <w:rFonts w:ascii="Times New Roman" w:hAnsi="Times New Roman" w:cs="Times New Roman"/>
+          <w:color w:val="000000" w:themeColor="text1"/>
+        </w:rPr>
+      </w:pPr>
+      <w:r>
+        <w:rPr>
+          <w:rFonts w:ascii="Times New Roman" w:hAnsi="Times New Roman" w:cs="Times New Roman"/>
+          <w:b/>
+          <w:bCs/>
+          <w:color w:val="000000" w:themeColor="text1"/>
         </w:rPr>
         <w:t>Empresa evaluada</w:t>
       </w:r>
       <w:r>
         <w:rPr>
-          <w:b/>
-          <w:bCs/>
+          <w:rFonts w:ascii="Times New Roman" w:hAnsi="Times New Roman" w:cs="Times New Roman"/>
+          <w:b/>
+          <w:bCs/>
+          <w:color w:val="000000" w:themeColor="text1"/>
         </w:rPr>
         <w:br/>
       </w:r>
       <w:r>
+        <w:rPr>
+          <w:rFonts w:ascii="Times New Roman" w:hAnsi="Times New Roman" w:cs="Times New Roman"/>
+          <w:color w:val="000000" w:themeColor="text1"/>
+        </w:rPr>
         <w:t>Vestidos y Costuras S.A.S.</w:t>
       </w:r>
     </w:p>
-    <w:p/>
-    <w:p/>
-    <w:p/>
-    <w:p/>
-    <w:p/>
-    <w:p/>
-    <w:p/>
-    <w:p/>
+    <w:p>
+      <w:pPr>
+        <w:rPr>
+          <w:rFonts w:ascii="Times New Roman" w:hAnsi="Times New Roman" w:cs="Times New Roman"/>
+          <w:color w:val="000000" w:themeColor="text1"/>
+        </w:rPr>
+      </w:pPr>
+    </w:p>
+    <w:p>
+      <w:pPr>
+        <w:rPr>
+          <w:rFonts w:ascii="Times New Roman" w:hAnsi="Times New Roman" w:cs="Times New Roman"/>
+          <w:color w:val="000000" w:themeColor="text1"/>
+        </w:rPr>
+      </w:pPr>
+    </w:p>
+    <w:p>
+      <w:pPr>
+        <w:rPr>
+          <w:rFonts w:ascii="Times New Roman" w:hAnsi="Times New Roman" w:cs="Times New Roman"/>
+          <w:color w:val="000000" w:themeColor="text1"/>
+        </w:rPr>
+      </w:pPr>
+    </w:p>
+    <w:p>
+      <w:pPr>
+        <w:rPr>
+          <w:rFonts w:ascii="Times New Roman" w:hAnsi="Times New Roman" w:cs="Times New Roman"/>
+          <w:color w:val="000000" w:themeColor="text1"/>
+        </w:rPr>
+      </w:pPr>
+    </w:p>
+    <w:p>
+      <w:pPr>
+        <w:rPr>
+          <w:rFonts w:ascii="Times New Roman" w:hAnsi="Times New Roman" w:cs="Times New Roman"/>
+          <w:color w:val="000000" w:themeColor="text1"/>
+        </w:rPr>
+      </w:pPr>
+    </w:p>
+    <w:p>
+      <w:pPr>
+        <w:rPr>
+          <w:rFonts w:ascii="Times New Roman" w:hAnsi="Times New Roman" w:cs="Times New Roman"/>
+          <w:color w:val="000000" w:themeColor="text1"/>
+        </w:rPr>
+      </w:pPr>
+    </w:p>
+    <w:p>
+      <w:pPr>
+        <w:rPr>
+          <w:rFonts w:ascii="Times New Roman" w:hAnsi="Times New Roman" w:cs="Times New Roman"/>
+          <w:color w:val="000000" w:themeColor="text1"/>
+        </w:rPr>
+      </w:pPr>
+    </w:p>
     <w:p>
       <w:pPr>
         <w:pStyle w:val="Ttulo2"/>
         <w:jc w:val="center"/>
         <w:rPr>
-          <w:b/>
-          <w:bCs/>
-        </w:rPr>
-      </w:pPr>
-      <w:r>
-        <w:rPr>
-          <w:b/>
-          <w:bCs/>
+          <w:rFonts w:ascii="Times New Roman" w:hAnsi="Times New Roman" w:cs="Times New Roman"/>
+          <w:b/>
+          <w:bCs/>
+          <w:color w:val="000000" w:themeColor="text1"/>
+        </w:rPr>
+      </w:pPr>
+      <w:r>
+        <w:rPr>
+          <w:rFonts w:ascii="Times New Roman" w:hAnsi="Times New Roman" w:cs="Times New Roman"/>
+          <w:b/>
+          <w:bCs/>
+          <w:color w:val="000000" w:themeColor="text1"/>
         </w:rPr>
         <w:lastRenderedPageBreak/>
         <w:t>1. Introducción y Contexto Normativo (SST)</w:t>
       </w:r>
     </w:p>
-    <w:p/>
-    <w:p>
-      <w:r>
+    <w:p>
+      <w:pPr>
+        <w:rPr>
+          <w:rFonts w:ascii="Times New Roman" w:hAnsi="Times New Roman" w:cs="Times New Roman"/>
+          <w:color w:val="000000" w:themeColor="text1"/>
+        </w:rPr>
+      </w:pPr>
+    </w:p>
+    <w:p>
+      <w:pPr>
+        <w:rPr>
+          <w:rFonts w:ascii="Times New Roman" w:hAnsi="Times New Roman" w:cs="Times New Roman"/>
+          <w:color w:val="000000" w:themeColor="text1"/>
+        </w:rPr>
+      </w:pPr>
+      <w:r>
+        <w:rPr>
+          <w:rFonts w:ascii="Times New Roman" w:hAnsi="Times New Roman" w:cs="Times New Roman"/>
+          <w:color w:val="000000" w:themeColor="text1"/>
+        </w:rPr>
         <w:t xml:space="preserve">El presente documento analiza la situación de riesgo locativo y físico identificada en la empresa </w:t>
       </w:r>
       <w:r>
         <w:rPr>
-          <w:b/>
-          <w:bCs/>
+          <w:rFonts w:ascii="Times New Roman" w:hAnsi="Times New Roman" w:cs="Times New Roman"/>
+          <w:b/>
+          <w:bCs/>
+          <w:color w:val="000000" w:themeColor="text1"/>
         </w:rPr>
         <w:t>Vestidos y Costuras S.A.S.</w:t>
       </w:r>
       <w:r>
+        <w:rPr>
+          <w:rFonts w:ascii="Times New Roman" w:hAnsi="Times New Roman" w:cs="Times New Roman"/>
+          <w:color w:val="000000" w:themeColor="text1"/>
+        </w:rPr>
         <w:t>, con el fin de evaluar las condiciones de trabajo y proponer medidas preventivas y correctivas basadas en el marco normativo colombiano de Seguridad y Salud en el Trabajo (SST).</w:t>
       </w:r>
     </w:p>
@@ -179,14 +369,18 @@
       <w:pPr>
         <w:pStyle w:val="Ttulo3"/>
         <w:rPr>
-          <w:b/>
-          <w:bCs/>
-        </w:rPr>
-      </w:pPr>
-      <w:r>
-        <w:rPr>
-          <w:b/>
-          <w:bCs/>
+          <w:rFonts w:ascii="Times New Roman" w:hAnsi="Times New Roman" w:cs="Times New Roman"/>
+          <w:b/>
+          <w:bCs/>
+          <w:color w:val="000000" w:themeColor="text1"/>
+        </w:rPr>
+      </w:pPr>
+      <w:r>
+        <w:rPr>
+          <w:rFonts w:ascii="Times New Roman" w:hAnsi="Times New Roman" w:cs="Times New Roman"/>
+          <w:b/>
+          <w:bCs/>
+          <w:color w:val="000000" w:themeColor="text1"/>
         </w:rPr>
         <w:t>Marco Legal Aplicable:</w:t>
       </w:r>
@@ -197,15 +391,25 @@
           <w:ilvl w:val="0"/>
           <w:numId w:val="1"/>
         </w:numPr>
-      </w:pPr>
-      <w:r>
-        <w:rPr>
-          <w:b/>
-          <w:bCs/>
+        <w:rPr>
+          <w:rFonts w:ascii="Times New Roman" w:hAnsi="Times New Roman" w:cs="Times New Roman"/>
+          <w:color w:val="000000" w:themeColor="text1"/>
+        </w:rPr>
+      </w:pPr>
+      <w:r>
+        <w:rPr>
+          <w:rFonts w:ascii="Times New Roman" w:hAnsi="Times New Roman" w:cs="Times New Roman"/>
+          <w:b/>
+          <w:bCs/>
+          <w:color w:val="000000" w:themeColor="text1"/>
         </w:rPr>
         <w:t>Ley 1562 de 2012:</w:t>
       </w:r>
       <w:r>
+        <w:rPr>
+          <w:rFonts w:ascii="Times New Roman" w:hAnsi="Times New Roman" w:cs="Times New Roman"/>
+          <w:color w:val="000000" w:themeColor="text1"/>
+        </w:rPr>
         <w:t xml:space="preserve"> Establece la responsabilidad del empleador en la prevención de Accidentes de Trabajo y Enfermedades Laborales (ATEL), así como el deber de garantizar ambientes de trabajo seguros.</w:t>
       </w:r>
     </w:p>
@@ -215,11 +419,17 @@
           <w:ilvl w:val="0"/>
           <w:numId w:val="1"/>
         </w:numPr>
-      </w:pPr>
-      <w:r>
-        <w:rPr>
-          <w:b/>
-          <w:bCs/>
+        <w:rPr>
+          <w:rFonts w:ascii="Times New Roman" w:hAnsi="Times New Roman" w:cs="Times New Roman"/>
+          <w:color w:val="000000" w:themeColor="text1"/>
+        </w:rPr>
+      </w:pPr>
+      <w:r>
+        <w:rPr>
+          <w:rFonts w:ascii="Times New Roman" w:hAnsi="Times New Roman" w:cs="Times New Roman"/>
+          <w:b/>
+          <w:bCs/>
+          <w:color w:val="000000" w:themeColor="text1"/>
         </w:rPr>
         <w:t>Decreto 1072 de 2015 (Único Reglamentario del Sector Trabajo):</w:t>
       </w:r>
@@ -230,15 +440,25 @@
           <w:ilvl w:val="1"/>
           <w:numId w:val="1"/>
         </w:numPr>
-      </w:pPr>
-      <w:r>
-        <w:rPr>
-          <w:b/>
-          <w:bCs/>
+        <w:rPr>
+          <w:rFonts w:ascii="Times New Roman" w:hAnsi="Times New Roman" w:cs="Times New Roman"/>
+          <w:color w:val="000000" w:themeColor="text1"/>
+        </w:rPr>
+      </w:pPr>
+      <w:r>
+        <w:rPr>
+          <w:rFonts w:ascii="Times New Roman" w:hAnsi="Times New Roman" w:cs="Times New Roman"/>
+          <w:b/>
+          <w:bCs/>
+          <w:color w:val="000000" w:themeColor="text1"/>
         </w:rPr>
         <w:t>Artículo 2.2.4.6.8:</w:t>
       </w:r>
       <w:r>
+        <w:rPr>
+          <w:rFonts w:ascii="Times New Roman" w:hAnsi="Times New Roman" w:cs="Times New Roman"/>
+          <w:color w:val="000000" w:themeColor="text1"/>
+        </w:rPr>
         <w:t xml:space="preserve"> Establece que los empleadores deben adoptar medidas para la identificación de peligros, evaluación y valoración de los riesgos.</w:t>
       </w:r>
     </w:p>
@@ -248,15 +468,25 @@
           <w:ilvl w:val="1"/>
           <w:numId w:val="1"/>
         </w:numPr>
-      </w:pPr>
-      <w:r>
-        <w:rPr>
-          <w:b/>
-          <w:bCs/>
+        <w:rPr>
+          <w:rFonts w:ascii="Times New Roman" w:hAnsi="Times New Roman" w:cs="Times New Roman"/>
+          <w:color w:val="000000" w:themeColor="text1"/>
+        </w:rPr>
+      </w:pPr>
+      <w:r>
+        <w:rPr>
+          <w:rFonts w:ascii="Times New Roman" w:hAnsi="Times New Roman" w:cs="Times New Roman"/>
+          <w:b/>
+          <w:bCs/>
+          <w:color w:val="000000" w:themeColor="text1"/>
         </w:rPr>
         <w:t>Artículo 2.2.4.6.15:</w:t>
       </w:r>
       <w:r>
+        <w:rPr>
+          <w:rFonts w:ascii="Times New Roman" w:hAnsi="Times New Roman" w:cs="Times New Roman"/>
+          <w:color w:val="000000" w:themeColor="text1"/>
+        </w:rPr>
         <w:t xml:space="preserve"> Obliga a la empresa a implementar un procedimiento para que los trabajadores reporten las condiciones e incidentes inseguros, y exige a la administración dar respuesta e intervención oportuna a dichos reportes.</w:t>
       </w:r>
     </w:p>
@@ -266,70 +496,144 @@
           <w:ilvl w:val="0"/>
           <w:numId w:val="1"/>
         </w:numPr>
-      </w:pPr>
-      <w:r>
-        <w:rPr>
-          <w:b/>
-          <w:bCs/>
+        <w:rPr>
+          <w:rFonts w:ascii="Times New Roman" w:hAnsi="Times New Roman" w:cs="Times New Roman"/>
+          <w:color w:val="000000" w:themeColor="text1"/>
+        </w:rPr>
+      </w:pPr>
+      <w:r>
+        <w:rPr>
+          <w:rFonts w:ascii="Times New Roman" w:hAnsi="Times New Roman" w:cs="Times New Roman"/>
+          <w:b/>
+          <w:bCs/>
+          <w:color w:val="000000" w:themeColor="text1"/>
         </w:rPr>
         <w:t>Resolución 2400 de 1979 (Estatuto de Higiene y Seguridad Industrial):</w:t>
       </w:r>
       <w:r>
+        <w:rPr>
+          <w:rFonts w:ascii="Times New Roman" w:hAnsi="Times New Roman" w:cs="Times New Roman"/>
+          <w:color w:val="000000" w:themeColor="text1"/>
+        </w:rPr>
         <w:t xml:space="preserve"> Regula los niveles mínimos de iluminación en las zonas de circulación e instalaciones industriales (Artículos 79 a 87) y las condiciones de seguridad en escaleras y pasillos (Artículos 9 a 16).</w:t>
       </w:r>
     </w:p>
     <w:p>
-      <w:r>
-        <w:rPr>
-          <w:b/>
-          <w:bCs/>
+      <w:pPr>
+        <w:rPr>
+          <w:rFonts w:ascii="Times New Roman" w:hAnsi="Times New Roman" w:cs="Times New Roman"/>
+          <w:color w:val="000000" w:themeColor="text1"/>
+        </w:rPr>
+      </w:pPr>
+      <w:r>
+        <w:rPr>
+          <w:rFonts w:ascii="Times New Roman" w:hAnsi="Times New Roman" w:cs="Times New Roman"/>
+          <w:b/>
+          <w:bCs/>
+          <w:color w:val="000000" w:themeColor="text1"/>
         </w:rPr>
         <w:t>Justificación Normativa del Caso:</w:t>
       </w:r>
       <w:r>
+        <w:rPr>
+          <w:rFonts w:ascii="Times New Roman" w:hAnsi="Times New Roman" w:cs="Times New Roman"/>
+          <w:color w:val="000000" w:themeColor="text1"/>
+        </w:rPr>
         <w:t xml:space="preserve"> En el caso expuesto, la empresa incurre en una omisión legal al no atender el reporte previo realizado por los trabajadores sobre la falta de iluminación en las escaleras del sótano.</w:t>
       </w:r>
       <w:r>
+        <w:rPr>
+          <w:rFonts w:ascii="Times New Roman" w:hAnsi="Times New Roman" w:cs="Times New Roman"/>
+          <w:color w:val="000000" w:themeColor="text1"/>
+        </w:rPr>
         <w:t xml:space="preserve"> </w:t>
       </w:r>
       <w:r>
+        <w:rPr>
+          <w:rFonts w:ascii="Times New Roman" w:hAnsi="Times New Roman" w:cs="Times New Roman"/>
+          <w:color w:val="000000" w:themeColor="text1"/>
+        </w:rPr>
         <w:t>Esta falta de intervención oportuna incrementa la probabilidad de que ocurra un Accidente de Trabajo (AT), vulnerando los principios del SG-SST y la protección integral de los operarios.</w:t>
       </w:r>
     </w:p>
-    <w:p/>
-    <w:p/>
-    <w:p/>
+    <w:p>
+      <w:pPr>
+        <w:rPr>
+          <w:rFonts w:ascii="Times New Roman" w:hAnsi="Times New Roman" w:cs="Times New Roman"/>
+          <w:color w:val="000000" w:themeColor="text1"/>
+        </w:rPr>
+      </w:pPr>
+    </w:p>
+    <w:p>
+      <w:pPr>
+        <w:rPr>
+          <w:rFonts w:ascii="Times New Roman" w:hAnsi="Times New Roman" w:cs="Times New Roman"/>
+          <w:color w:val="000000" w:themeColor="text1"/>
+        </w:rPr>
+      </w:pPr>
+    </w:p>
+    <w:p>
+      <w:pPr>
+        <w:rPr>
+          <w:rFonts w:ascii="Times New Roman" w:hAnsi="Times New Roman" w:cs="Times New Roman"/>
+          <w:color w:val="000000" w:themeColor="text1"/>
+        </w:rPr>
+      </w:pPr>
+    </w:p>
+    <w:p>
+      <w:pPr>
+        <w:rPr>
+          <w:rFonts w:ascii="Times New Roman" w:hAnsi="Times New Roman" w:cs="Times New Roman"/>
+          <w:color w:val="000000" w:themeColor="text1"/>
+        </w:rPr>
+      </w:pPr>
+    </w:p>
     <w:p>
       <w:pPr>
         <w:pStyle w:val="Ttulo2"/>
         <w:jc w:val="center"/>
         <w:rPr>
-          <w:b/>
-          <w:bCs/>
-        </w:rPr>
-      </w:pPr>
-      <w:r>
-        <w:rPr>
-          <w:b/>
-          <w:bCs/>
+          <w:rFonts w:ascii="Times New Roman" w:hAnsi="Times New Roman" w:cs="Times New Roman"/>
+          <w:b/>
+          <w:bCs/>
+          <w:color w:val="000000" w:themeColor="text1"/>
+        </w:rPr>
+      </w:pPr>
+      <w:r>
+        <w:rPr>
+          <w:rFonts w:ascii="Times New Roman" w:hAnsi="Times New Roman" w:cs="Times New Roman"/>
+          <w:b/>
+          <w:bCs/>
+          <w:color w:val="000000" w:themeColor="text1"/>
         </w:rPr>
         <w:lastRenderedPageBreak/>
         <w:t>2. Análisis e Interpretación del Caso: "Vestidos y Costuras S.A.S."</w:t>
       </w:r>
     </w:p>
-    <w:p/>
+    <w:p>
+      <w:pPr>
+        <w:rPr>
+          <w:rFonts w:ascii="Times New Roman" w:hAnsi="Times New Roman" w:cs="Times New Roman"/>
+          <w:color w:val="000000" w:themeColor="text1"/>
+        </w:rPr>
+      </w:pPr>
+    </w:p>
     <w:p>
       <w:pPr>
         <w:pStyle w:val="Ttulo3"/>
         <w:rPr>
-          <w:b/>
-          <w:bCs/>
-        </w:rPr>
-      </w:pPr>
-      <w:r>
-        <w:rPr>
-          <w:b/>
-          <w:bCs/>
+          <w:rFonts w:ascii="Times New Roman" w:hAnsi="Times New Roman" w:cs="Times New Roman"/>
+          <w:b/>
+          <w:bCs/>
+          <w:color w:val="000000" w:themeColor="text1"/>
+        </w:rPr>
+      </w:pPr>
+      <w:r>
+        <w:rPr>
+          <w:rFonts w:ascii="Times New Roman" w:hAnsi="Times New Roman" w:cs="Times New Roman"/>
+          <w:b/>
+          <w:bCs/>
+          <w:color w:val="000000" w:themeColor="text1"/>
         </w:rPr>
         <w:t>2.1. Identificación y Justificación de las Condiciones de Seguridad</w:t>
       </w:r>
@@ -340,15 +644,25 @@
           <w:ilvl w:val="0"/>
           <w:numId w:val="2"/>
         </w:numPr>
-      </w:pPr>
-      <w:r>
-        <w:rPr>
-          <w:b/>
-          <w:bCs/>
+        <w:rPr>
+          <w:rFonts w:ascii="Times New Roman" w:hAnsi="Times New Roman" w:cs="Times New Roman"/>
+          <w:color w:val="000000" w:themeColor="text1"/>
+        </w:rPr>
+      </w:pPr>
+      <w:r>
+        <w:rPr>
+          <w:rFonts w:ascii="Times New Roman" w:hAnsi="Times New Roman" w:cs="Times New Roman"/>
+          <w:b/>
+          <w:bCs/>
+          <w:color w:val="000000" w:themeColor="text1"/>
         </w:rPr>
         <w:t>Condición Insegura Identificada:</w:t>
       </w:r>
       <w:r>
+        <w:rPr>
+          <w:rFonts w:ascii="Times New Roman" w:hAnsi="Times New Roman" w:cs="Times New Roman"/>
+          <w:color w:val="000000" w:themeColor="text1"/>
+        </w:rPr>
         <w:t xml:space="preserve"> Falta de iluminación artificial adecuada y deficiencia en la infraestructura de la zona de tránsito (escaleras que conectan con el sótano).</w:t>
       </w:r>
     </w:p>
@@ -358,25 +672,41 @@
           <w:ilvl w:val="0"/>
           <w:numId w:val="2"/>
         </w:numPr>
-      </w:pPr>
-      <w:r>
-        <w:rPr>
-          <w:b/>
-          <w:bCs/>
+        <w:rPr>
+          <w:rFonts w:ascii="Times New Roman" w:hAnsi="Times New Roman" w:cs="Times New Roman"/>
+          <w:color w:val="000000" w:themeColor="text1"/>
+        </w:rPr>
+      </w:pPr>
+      <w:r>
+        <w:rPr>
+          <w:rFonts w:ascii="Times New Roman" w:hAnsi="Times New Roman" w:cs="Times New Roman"/>
+          <w:b/>
+          <w:bCs/>
+          <w:color w:val="000000" w:themeColor="text1"/>
         </w:rPr>
         <w:t>Justificación:</w:t>
       </w:r>
       <w:r>
+        <w:rPr>
+          <w:rFonts w:ascii="Times New Roman" w:hAnsi="Times New Roman" w:cs="Times New Roman"/>
+          <w:color w:val="000000" w:themeColor="text1"/>
+        </w:rPr>
         <w:t xml:space="preserve"> Las escaleras son vías de circulación peatonal de uso obligatorio y diario para que los operarios lleguen a sus puestos de trabajo en las máquinas bordadoras. Al no contar con los niveles de luminancia requeridos por la </w:t>
       </w:r>
       <w:r>
         <w:rPr>
-          <w:b/>
-          <w:bCs/>
+          <w:rFonts w:ascii="Times New Roman" w:hAnsi="Times New Roman" w:cs="Times New Roman"/>
+          <w:b/>
+          <w:bCs/>
+          <w:color w:val="000000" w:themeColor="text1"/>
         </w:rPr>
         <w:t>Resolución 2400 de 1979</w:t>
       </w:r>
       <w:r>
+        <w:rPr>
+          <w:rFonts w:ascii="Times New Roman" w:hAnsi="Times New Roman" w:cs="Times New Roman"/>
+          <w:color w:val="000000" w:themeColor="text1"/>
+        </w:rPr>
         <w:t>, la visión de las huellas y contrahuellas de los escalones se dificulta, convirtiendo un área común en una zona de alto riesgo de caídas y tropiezos.</w:t>
       </w:r>
     </w:p>
@@ -384,14 +714,18 @@
       <w:pPr>
         <w:pStyle w:val="Ttulo3"/>
         <w:rPr>
-          <w:b/>
-          <w:bCs/>
-        </w:rPr>
-      </w:pPr>
-      <w:r>
-        <w:rPr>
-          <w:b/>
-          <w:bCs/>
+          <w:rFonts w:ascii="Times New Roman" w:hAnsi="Times New Roman" w:cs="Times New Roman"/>
+          <w:b/>
+          <w:bCs/>
+          <w:color w:val="000000" w:themeColor="text1"/>
+        </w:rPr>
+      </w:pPr>
+      <w:r>
+        <w:rPr>
+          <w:rFonts w:ascii="Times New Roman" w:hAnsi="Times New Roman" w:cs="Times New Roman"/>
+          <w:b/>
+          <w:bCs/>
+          <w:color w:val="000000" w:themeColor="text1"/>
         </w:rPr>
         <w:t>2.2. Factores de Riesgo Presentes</w:t>
       </w:r>
@@ -402,15 +736,25 @@
           <w:ilvl w:val="0"/>
           <w:numId w:val="3"/>
         </w:numPr>
-      </w:pPr>
-      <w:r>
-        <w:rPr>
-          <w:b/>
-          <w:bCs/>
+        <w:rPr>
+          <w:rFonts w:ascii="Times New Roman" w:hAnsi="Times New Roman" w:cs="Times New Roman"/>
+          <w:color w:val="000000" w:themeColor="text1"/>
+        </w:rPr>
+      </w:pPr>
+      <w:r>
+        <w:rPr>
+          <w:rFonts w:ascii="Times New Roman" w:hAnsi="Times New Roman" w:cs="Times New Roman"/>
+          <w:b/>
+          <w:bCs/>
+          <w:color w:val="000000" w:themeColor="text1"/>
         </w:rPr>
         <w:t>Factor de Riesgo Físico (Deficiencia de Iluminación):</w:t>
       </w:r>
       <w:r>
+        <w:rPr>
+          <w:rFonts w:ascii="Times New Roman" w:hAnsi="Times New Roman" w:cs="Times New Roman"/>
+          <w:color w:val="000000" w:themeColor="text1"/>
+        </w:rPr>
         <w:t xml:space="preserve"> La baja intensidad de luz en las escaleras genera sombras, deslumbramientos o falta de contraste, obligando a la vista del trabajador a esforzarse o adaptarse bruscamente al descender, lo que reduce la capacidad de anticipar el fin de un escalón.</w:t>
       </w:r>
     </w:p>
@@ -420,15 +764,25 @@
           <w:ilvl w:val="0"/>
           <w:numId w:val="3"/>
         </w:numPr>
-      </w:pPr>
-      <w:r>
-        <w:rPr>
-          <w:b/>
-          <w:bCs/>
+        <w:rPr>
+          <w:rFonts w:ascii="Times New Roman" w:hAnsi="Times New Roman" w:cs="Times New Roman"/>
+          <w:color w:val="000000" w:themeColor="text1"/>
+        </w:rPr>
+      </w:pPr>
+      <w:r>
+        <w:rPr>
+          <w:rFonts w:ascii="Times New Roman" w:hAnsi="Times New Roman" w:cs="Times New Roman"/>
+          <w:b/>
+          <w:bCs/>
+          <w:color w:val="000000" w:themeColor="text1"/>
         </w:rPr>
         <w:t>Factor de Riesgo Locativo (Superficies de Tránsito y Escaleras):</w:t>
       </w:r>
       <w:r>
+        <w:rPr>
+          <w:rFonts w:ascii="Times New Roman" w:hAnsi="Times New Roman" w:cs="Times New Roman"/>
+          <w:color w:val="000000" w:themeColor="text1"/>
+        </w:rPr>
         <w:t xml:space="preserve"> Tránsito por escaleras con probable ausencia de señalización antideslizante, pasamanos a ambos lados o demarcación de bordes, lo que incrementa el riesgo de pérdida de equilibrio.</w:t>
       </w:r>
     </w:p>
@@ -438,31 +792,94 @@
           <w:ilvl w:val="0"/>
           <w:numId w:val="3"/>
         </w:numPr>
-      </w:pPr>
-      <w:r>
-        <w:rPr>
-          <w:b/>
-          <w:bCs/>
+        <w:rPr>
+          <w:rFonts w:ascii="Times New Roman" w:hAnsi="Times New Roman" w:cs="Times New Roman"/>
+          <w:color w:val="000000" w:themeColor="text1"/>
+        </w:rPr>
+      </w:pPr>
+      <w:r>
+        <w:rPr>
+          <w:rFonts w:ascii="Times New Roman" w:hAnsi="Times New Roman" w:cs="Times New Roman"/>
+          <w:b/>
+          <w:bCs/>
+          <w:color w:val="000000" w:themeColor="text1"/>
         </w:rPr>
         <w:t>Factor de Riesgo Administrativo / Organizacional:</w:t>
       </w:r>
       <w:r>
+        <w:rPr>
+          <w:rFonts w:ascii="Times New Roman" w:hAnsi="Times New Roman" w:cs="Times New Roman"/>
+          <w:color w:val="000000" w:themeColor="text1"/>
+        </w:rPr>
         <w:t xml:space="preserve"> Falla en la gestión del SG-SST por la falta de atención e intervención oportuna tras el reporte previo realizado por los empleados.</w:t>
       </w:r>
     </w:p>
     <w:p>
       <w:pPr>
+        <w:rPr>
+          <w:rFonts w:ascii="Times New Roman" w:hAnsi="Times New Roman" w:cs="Times New Roman"/>
+          <w:color w:val="000000" w:themeColor="text1"/>
+        </w:rPr>
+      </w:pPr>
+    </w:p>
+    <w:p>
+      <w:pPr>
+        <w:rPr>
+          <w:rFonts w:ascii="Times New Roman" w:hAnsi="Times New Roman" w:cs="Times New Roman"/>
+          <w:color w:val="000000" w:themeColor="text1"/>
+        </w:rPr>
+      </w:pPr>
+    </w:p>
+    <w:p>
+      <w:pPr>
+        <w:rPr>
+          <w:rFonts w:ascii="Times New Roman" w:hAnsi="Times New Roman" w:cs="Times New Roman"/>
+          <w:color w:val="000000" w:themeColor="text1"/>
+        </w:rPr>
+      </w:pPr>
+    </w:p>
+    <w:p>
+      <w:pPr>
+        <w:rPr>
+          <w:rFonts w:ascii="Times New Roman" w:hAnsi="Times New Roman" w:cs="Times New Roman"/>
+          <w:color w:val="000000" w:themeColor="text1"/>
+        </w:rPr>
+      </w:pPr>
+    </w:p>
+    <w:p>
+      <w:pPr>
+        <w:rPr>
+          <w:rFonts w:ascii="Times New Roman" w:hAnsi="Times New Roman" w:cs="Times New Roman"/>
+          <w:color w:val="000000" w:themeColor="text1"/>
+        </w:rPr>
+      </w:pPr>
+    </w:p>
+    <w:p>
+      <w:pPr>
+        <w:rPr>
+          <w:rFonts w:ascii="Times New Roman" w:hAnsi="Times New Roman" w:cs="Times New Roman"/>
+          <w:color w:val="000000" w:themeColor="text1"/>
+        </w:rPr>
+      </w:pPr>
+    </w:p>
+    <w:p>
+      <w:pPr>
         <w:pStyle w:val="Ttulo3"/>
         <w:rPr>
-          <w:b/>
-          <w:bCs/>
-        </w:rPr>
-      </w:pPr>
-      <w:r>
-        <w:rPr>
-          <w:b/>
-          <w:bCs/>
-        </w:rPr>
+          <w:rFonts w:ascii="Times New Roman" w:hAnsi="Times New Roman" w:cs="Times New Roman"/>
+          <w:b/>
+          <w:bCs/>
+          <w:color w:val="000000" w:themeColor="text1"/>
+        </w:rPr>
+      </w:pPr>
+      <w:r>
+        <w:rPr>
+          <w:rFonts w:ascii="Times New Roman" w:hAnsi="Times New Roman" w:cs="Times New Roman"/>
+          <w:b/>
+          <w:bCs/>
+          <w:color w:val="000000" w:themeColor="text1"/>
+        </w:rPr>
+        <w:lastRenderedPageBreak/>
         <w:t>2.3. Tipos de Peligro (Según Clasificación de la GTC 45)</w:t>
       </w:r>
     </w:p>
@@ -472,11 +889,17 @@
           <w:ilvl w:val="0"/>
           <w:numId w:val="4"/>
         </w:numPr>
-      </w:pPr>
-      <w:r>
-        <w:rPr>
-          <w:b/>
-          <w:bCs/>
+        <w:rPr>
+          <w:rFonts w:ascii="Times New Roman" w:hAnsi="Times New Roman" w:cs="Times New Roman"/>
+          <w:color w:val="000000" w:themeColor="text1"/>
+        </w:rPr>
+      </w:pPr>
+      <w:r>
+        <w:rPr>
+          <w:rFonts w:ascii="Times New Roman" w:hAnsi="Times New Roman" w:cs="Times New Roman"/>
+          <w:b/>
+          <w:bCs/>
+          <w:color w:val="000000" w:themeColor="text1"/>
         </w:rPr>
         <w:t>a. Peligro Físico – Iluminación (Luz deficiente por ausencia o mal estado de luminarias):</w:t>
       </w:r>
@@ -487,15 +910,25 @@
           <w:ilvl w:val="1"/>
           <w:numId w:val="4"/>
         </w:numPr>
-      </w:pPr>
-      <w:r>
-        <w:rPr>
+        <w:rPr>
+          <w:rFonts w:ascii="Times New Roman" w:hAnsi="Times New Roman" w:cs="Times New Roman"/>
+          <w:color w:val="000000" w:themeColor="text1"/>
+        </w:rPr>
+      </w:pPr>
+      <w:r>
+        <w:rPr>
+          <w:rFonts w:ascii="Times New Roman" w:hAnsi="Times New Roman" w:cs="Times New Roman"/>
           <w:i/>
           <w:iCs/>
+          <w:color w:val="000000" w:themeColor="text1"/>
         </w:rPr>
         <w:t>Efecto posible en la salud/seguridad:</w:t>
       </w:r>
       <w:r>
+        <w:rPr>
+          <w:rFonts w:ascii="Times New Roman" w:hAnsi="Times New Roman" w:cs="Times New Roman"/>
+          <w:color w:val="000000" w:themeColor="text1"/>
+        </w:rPr>
         <w:t xml:space="preserve"> Fatiga ocular, dolor de cabeza, disminución temporal de la agudeza visual, adaptación lenta a la oscuridad y tropezones por mala percepción de profundidad.</w:t>
       </w:r>
     </w:p>
@@ -505,11 +938,17 @@
           <w:ilvl w:val="0"/>
           <w:numId w:val="4"/>
         </w:numPr>
-      </w:pPr>
-      <w:r>
-        <w:rPr>
-          <w:b/>
-          <w:bCs/>
+        <w:rPr>
+          <w:rFonts w:ascii="Times New Roman" w:hAnsi="Times New Roman" w:cs="Times New Roman"/>
+          <w:color w:val="000000" w:themeColor="text1"/>
+        </w:rPr>
+      </w:pPr>
+      <w:r>
+        <w:rPr>
+          <w:rFonts w:ascii="Times New Roman" w:hAnsi="Times New Roman" w:cs="Times New Roman"/>
+          <w:b/>
+          <w:bCs/>
+          <w:color w:val="000000" w:themeColor="text1"/>
         </w:rPr>
         <w:t>b. Peligro Locativo – Superficies de trabajo (Escaleras y vías de circulación):</w:t>
       </w:r>
@@ -520,28 +959,53 @@
           <w:ilvl w:val="1"/>
           <w:numId w:val="4"/>
         </w:numPr>
-      </w:pPr>
-      <w:r>
-        <w:rPr>
+        <w:rPr>
+          <w:rFonts w:ascii="Times New Roman" w:hAnsi="Times New Roman" w:cs="Times New Roman"/>
+          <w:color w:val="000000" w:themeColor="text1"/>
+        </w:rPr>
+      </w:pPr>
+      <w:r>
+        <w:rPr>
+          <w:rFonts w:ascii="Times New Roman" w:hAnsi="Times New Roman" w:cs="Times New Roman"/>
           <w:i/>
           <w:iCs/>
-        </w:rPr>
-        <w:lastRenderedPageBreak/>
+          <w:color w:val="000000" w:themeColor="text1"/>
+        </w:rPr>
         <w:t>Efecto posible en la salud/seguridad:</w:t>
       </w:r>
       <w:r>
+        <w:rPr>
+          <w:rFonts w:ascii="Times New Roman" w:hAnsi="Times New Roman" w:cs="Times New Roman"/>
+          <w:color w:val="000000" w:themeColor="text1"/>
+        </w:rPr>
         <w:t xml:space="preserve"> Caídas a diferente nivel, caídas al mismo nivel, esguinces, torceduras de tobillo, contusiones, fracturas de miembros inferiores/superiores</w:t>
       </w:r>
       <w:r>
+        <w:rPr>
+          <w:rFonts w:ascii="Times New Roman" w:hAnsi="Times New Roman" w:cs="Times New Roman"/>
+          <w:color w:val="000000" w:themeColor="text1"/>
+        </w:rPr>
         <w:t xml:space="preserve">, </w:t>
       </w:r>
       <w:r>
+        <w:rPr>
+          <w:rFonts w:ascii="Times New Roman" w:hAnsi="Times New Roman" w:cs="Times New Roman"/>
+          <w:color w:val="000000" w:themeColor="text1"/>
+        </w:rPr>
         <w:t>traumatismos craneoencefálicos</w:t>
       </w:r>
       <w:r>
+        <w:rPr>
+          <w:rFonts w:ascii="Times New Roman" w:hAnsi="Times New Roman" w:cs="Times New Roman"/>
+          <w:color w:val="000000" w:themeColor="text1"/>
+        </w:rPr>
         <w:t xml:space="preserve"> e inclusive la muerte</w:t>
       </w:r>
       <w:r>
+        <w:rPr>
+          <w:rFonts w:ascii="Times New Roman" w:hAnsi="Times New Roman" w:cs="Times New Roman"/>
+          <w:color w:val="000000" w:themeColor="text1"/>
+        </w:rPr>
         <w:t>.</w:t>
       </w:r>
     </w:p>
@@ -549,20 +1013,34 @@
       <w:pPr>
         <w:pStyle w:val="Ttulo3"/>
         <w:rPr>
-          <w:b/>
-          <w:bCs/>
-        </w:rPr>
-      </w:pPr>
-      <w:r>
-        <w:rPr>
-          <w:b/>
-          <w:bCs/>
+          <w:rFonts w:ascii="Times New Roman" w:hAnsi="Times New Roman" w:cs="Times New Roman"/>
+          <w:b/>
+          <w:bCs/>
+          <w:color w:val="000000" w:themeColor="text1"/>
+        </w:rPr>
+      </w:pPr>
+      <w:r>
+        <w:rPr>
+          <w:rFonts w:ascii="Times New Roman" w:hAnsi="Times New Roman" w:cs="Times New Roman"/>
+          <w:b/>
+          <w:bCs/>
+          <w:color w:val="000000" w:themeColor="text1"/>
         </w:rPr>
         <w:t>2.4. Condiciones de Seguridad por Actividad Económica (Sector Confecciones y Textil)</w:t>
       </w:r>
     </w:p>
     <w:p>
-      <w:r>
+      <w:pPr>
+        <w:rPr>
+          <w:rFonts w:ascii="Times New Roman" w:hAnsi="Times New Roman" w:cs="Times New Roman"/>
+          <w:color w:val="000000" w:themeColor="text1"/>
+        </w:rPr>
+      </w:pPr>
+      <w:r>
+        <w:rPr>
+          <w:rFonts w:ascii="Times New Roman" w:hAnsi="Times New Roman" w:cs="Times New Roman"/>
+          <w:color w:val="000000" w:themeColor="text1"/>
+        </w:rPr>
         <w:t>En la actividad económica de fabricación y bordado de prendas de vestir, las condiciones de seguridad deben abordar integralmente los siguientes aspectos:</w:t>
       </w:r>
     </w:p>
@@ -572,15 +1050,25 @@
           <w:ilvl w:val="0"/>
           <w:numId w:val="5"/>
         </w:numPr>
-      </w:pPr>
-      <w:r>
-        <w:rPr>
-          <w:b/>
-          <w:bCs/>
+        <w:rPr>
+          <w:rFonts w:ascii="Times New Roman" w:hAnsi="Times New Roman" w:cs="Times New Roman"/>
+          <w:color w:val="000000" w:themeColor="text1"/>
+        </w:rPr>
+      </w:pPr>
+      <w:r>
+        <w:rPr>
+          <w:rFonts w:ascii="Times New Roman" w:hAnsi="Times New Roman" w:cs="Times New Roman"/>
+          <w:b/>
+          <w:bCs/>
+          <w:color w:val="000000" w:themeColor="text1"/>
         </w:rPr>
         <w:t>Condiciones Locativas y de Iluminación General:</w:t>
       </w:r>
       <w:r>
+        <w:rPr>
+          <w:rFonts w:ascii="Times New Roman" w:hAnsi="Times New Roman" w:cs="Times New Roman"/>
+          <w:color w:val="000000" w:themeColor="text1"/>
+        </w:rPr>
         <w:t xml:space="preserve"> Mantener zonas de tránsito, pasillos, escaleras y bodegas adecuadamente iluminadas, despejadas y con pisos no deslumbrantes ni resbaladizos para el transporte seguro de rollos de tela e insumos.</w:t>
       </w:r>
     </w:p>
@@ -590,15 +1078,25 @@
           <w:ilvl w:val="0"/>
           <w:numId w:val="5"/>
         </w:numPr>
-      </w:pPr>
-      <w:r>
-        <w:rPr>
-          <w:b/>
-          <w:bCs/>
+        <w:rPr>
+          <w:rFonts w:ascii="Times New Roman" w:hAnsi="Times New Roman" w:cs="Times New Roman"/>
+          <w:color w:val="000000" w:themeColor="text1"/>
+        </w:rPr>
+      </w:pPr>
+      <w:r>
+        <w:rPr>
+          <w:rFonts w:ascii="Times New Roman" w:hAnsi="Times New Roman" w:cs="Times New Roman"/>
+          <w:b/>
+          <w:bCs/>
+          <w:color w:val="000000" w:themeColor="text1"/>
         </w:rPr>
         <w:t>Riesgo Mecánico (Maquinaria Textil):</w:t>
       </w:r>
       <w:r>
+        <w:rPr>
+          <w:rFonts w:ascii="Times New Roman" w:hAnsi="Times New Roman" w:cs="Times New Roman"/>
+          <w:color w:val="000000" w:themeColor="text1"/>
+        </w:rPr>
         <w:t xml:space="preserve"> Asegurar que las máquinas bordadoras e industriales cuenten con guardas de protección en partes móviles (poleas, correas, volantes) y protectores de dedos/ojos en las zonas de punzonado de aguja.</w:t>
       </w:r>
     </w:p>
@@ -608,15 +1106,25 @@
           <w:ilvl w:val="0"/>
           <w:numId w:val="5"/>
         </w:numPr>
-      </w:pPr>
-      <w:r>
-        <w:rPr>
-          <w:b/>
-          <w:bCs/>
+        <w:rPr>
+          <w:rFonts w:ascii="Times New Roman" w:hAnsi="Times New Roman" w:cs="Times New Roman"/>
+          <w:color w:val="000000" w:themeColor="text1"/>
+        </w:rPr>
+      </w:pPr>
+      <w:r>
+        <w:rPr>
+          <w:rFonts w:ascii="Times New Roman" w:hAnsi="Times New Roman" w:cs="Times New Roman"/>
+          <w:b/>
+          <w:bCs/>
+          <w:color w:val="000000" w:themeColor="text1"/>
         </w:rPr>
         <w:t>Riesgo Eléctrico:</w:t>
       </w:r>
       <w:r>
+        <w:rPr>
+          <w:rFonts w:ascii="Times New Roman" w:hAnsi="Times New Roman" w:cs="Times New Roman"/>
+          <w:color w:val="000000" w:themeColor="text1"/>
+        </w:rPr>
         <w:t xml:space="preserve"> Garantizar un sistema de cableado estructurado y canalizado para alimentar la alta densidad de motores eléctricos de las máquinas bordadoras, previniendo cortocircuitos o sobrecargas.</w:t>
       </w:r>
     </w:p>
@@ -626,15 +1134,25 @@
           <w:ilvl w:val="0"/>
           <w:numId w:val="5"/>
         </w:numPr>
-      </w:pPr>
-      <w:r>
-        <w:rPr>
-          <w:b/>
-          <w:bCs/>
+        <w:rPr>
+          <w:rFonts w:ascii="Times New Roman" w:hAnsi="Times New Roman" w:cs="Times New Roman"/>
+          <w:color w:val="000000" w:themeColor="text1"/>
+        </w:rPr>
+      </w:pPr>
+      <w:r>
+        <w:rPr>
+          <w:rFonts w:ascii="Times New Roman" w:hAnsi="Times New Roman" w:cs="Times New Roman"/>
+          <w:b/>
+          <w:bCs/>
+          <w:color w:val="000000" w:themeColor="text1"/>
         </w:rPr>
         <w:t>Riesgo Biomecánico y Ergonomía:</w:t>
       </w:r>
       <w:r>
+        <w:rPr>
+          <w:rFonts w:ascii="Times New Roman" w:hAnsi="Times New Roman" w:cs="Times New Roman"/>
+          <w:color w:val="000000" w:themeColor="text1"/>
+        </w:rPr>
         <w:t xml:space="preserve"> Disponer de sillas ergonómicas ajustables y estaciones de trabajo que mitiguen las posturas prolongadas sentadas y los movimientos repetitivos de miembros superiores característicos del bordado.</w:t>
       </w:r>
     </w:p>
@@ -644,55 +1162,82 @@
           <w:ilvl w:val="0"/>
           <w:numId w:val="5"/>
         </w:numPr>
-      </w:pPr>
-      <w:r>
-        <w:rPr>
-          <w:b/>
-          <w:bCs/>
+        <w:rPr>
+          <w:rFonts w:ascii="Times New Roman" w:hAnsi="Times New Roman" w:cs="Times New Roman"/>
+          <w:color w:val="000000" w:themeColor="text1"/>
+        </w:rPr>
+      </w:pPr>
+      <w:r>
+        <w:rPr>
+          <w:rFonts w:ascii="Times New Roman" w:hAnsi="Times New Roman" w:cs="Times New Roman"/>
+          <w:b/>
+          <w:bCs/>
+          <w:color w:val="000000" w:themeColor="text1"/>
         </w:rPr>
         <w:t>Higiene Industrial (Material Particulado):</w:t>
       </w:r>
       <w:r>
+        <w:rPr>
+          <w:rFonts w:ascii="Times New Roman" w:hAnsi="Times New Roman" w:cs="Times New Roman"/>
+          <w:color w:val="000000" w:themeColor="text1"/>
+        </w:rPr>
         <w:t xml:space="preserve"> Control de fibras y polvo textil en suspensión mediante sistemas de ventilación o extracción para proteger las vías respiratorias de los trabajadores.</w:t>
       </w:r>
     </w:p>
-    <w:p/>
-    <w:p/>
-    <w:p/>
-    <w:p/>
-    <w:p/>
-    <w:p/>
+    <w:p>
+      <w:pPr>
+        <w:rPr>
+          <w:rFonts w:ascii="Times New Roman" w:hAnsi="Times New Roman" w:cs="Times New Roman"/>
+          <w:color w:val="000000" w:themeColor="text1"/>
+        </w:rPr>
+      </w:pPr>
+    </w:p>
     <w:p>
       <w:pPr>
         <w:pStyle w:val="Ttulo2"/>
         <w:jc w:val="center"/>
         <w:rPr>
-          <w:b/>
-          <w:bCs/>
-        </w:rPr>
-      </w:pPr>
-      <w:r>
-        <w:rPr>
-          <w:b/>
-          <w:bCs/>
+          <w:rFonts w:ascii="Times New Roman" w:hAnsi="Times New Roman" w:cs="Times New Roman"/>
+          <w:b/>
+          <w:bCs/>
+          <w:color w:val="000000" w:themeColor="text1"/>
+        </w:rPr>
+      </w:pPr>
+      <w:r>
+        <w:rPr>
+          <w:rFonts w:ascii="Times New Roman" w:hAnsi="Times New Roman" w:cs="Times New Roman"/>
+          <w:b/>
+          <w:bCs/>
+          <w:color w:val="000000" w:themeColor="text1"/>
         </w:rPr>
         <w:lastRenderedPageBreak/>
         <w:t>3. Matriz de Identificación de Peligros y Valoración de Riesgos (GTC 45)</w:t>
       </w:r>
     </w:p>
-    <w:p/>
+    <w:p>
+      <w:pPr>
+        <w:rPr>
+          <w:rFonts w:ascii="Times New Roman" w:hAnsi="Times New Roman" w:cs="Times New Roman"/>
+          <w:color w:val="000000" w:themeColor="text1"/>
+        </w:rPr>
+      </w:pPr>
+    </w:p>
     <w:p>
       <w:pPr>
         <w:pStyle w:val="Ttulo3"/>
         <w:rPr>
-          <w:b/>
-          <w:bCs/>
-        </w:rPr>
-      </w:pPr>
-      <w:r>
-        <w:rPr>
-          <w:b/>
-          <w:bCs/>
+          <w:rFonts w:ascii="Times New Roman" w:hAnsi="Times New Roman" w:cs="Times New Roman"/>
+          <w:b/>
+          <w:bCs/>
+          <w:color w:val="000000" w:themeColor="text1"/>
+        </w:rPr>
+      </w:pPr>
+      <w:r>
+        <w:rPr>
+          <w:rFonts w:ascii="Times New Roman" w:hAnsi="Times New Roman" w:cs="Times New Roman"/>
+          <w:b/>
+          <w:bCs/>
+          <w:color w:val="000000" w:themeColor="text1"/>
         </w:rPr>
         <w:t>Riesgo 1: Peligro Físico (Deficiencia de Iluminación)</w:t>
       </w:r>
@@ -703,15 +1248,25 @@
           <w:ilvl w:val="0"/>
           <w:numId w:val="6"/>
         </w:numPr>
-      </w:pPr>
-      <w:r>
-        <w:rPr>
-          <w:b/>
-          <w:bCs/>
+        <w:rPr>
+          <w:rFonts w:ascii="Times New Roman" w:hAnsi="Times New Roman" w:cs="Times New Roman"/>
+          <w:color w:val="000000" w:themeColor="text1"/>
+        </w:rPr>
+      </w:pPr>
+      <w:r>
+        <w:rPr>
+          <w:rFonts w:ascii="Times New Roman" w:hAnsi="Times New Roman" w:cs="Times New Roman"/>
+          <w:b/>
+          <w:bCs/>
+          <w:color w:val="000000" w:themeColor="text1"/>
         </w:rPr>
         <w:t>Proceso / Actividad:</w:t>
       </w:r>
       <w:r>
+        <w:rPr>
+          <w:rFonts w:ascii="Times New Roman" w:hAnsi="Times New Roman" w:cs="Times New Roman"/>
+          <w:color w:val="000000" w:themeColor="text1"/>
+        </w:rPr>
         <w:t xml:space="preserve"> Operativo / Desplazamiento hacia el área de bordadoras en el sótano.</w:t>
       </w:r>
     </w:p>
@@ -721,15 +1276,25 @@
           <w:ilvl w:val="0"/>
           <w:numId w:val="6"/>
         </w:numPr>
-      </w:pPr>
-      <w:r>
-        <w:rPr>
-          <w:b/>
-          <w:bCs/>
+        <w:rPr>
+          <w:rFonts w:ascii="Times New Roman" w:hAnsi="Times New Roman" w:cs="Times New Roman"/>
+          <w:color w:val="000000" w:themeColor="text1"/>
+        </w:rPr>
+      </w:pPr>
+      <w:r>
+        <w:rPr>
+          <w:rFonts w:ascii="Times New Roman" w:hAnsi="Times New Roman" w:cs="Times New Roman"/>
+          <w:b/>
+          <w:bCs/>
+          <w:color w:val="000000" w:themeColor="text1"/>
         </w:rPr>
         <w:t>Actividad Rutinaria:</w:t>
       </w:r>
       <w:r>
+        <w:rPr>
+          <w:rFonts w:ascii="Times New Roman" w:hAnsi="Times New Roman" w:cs="Times New Roman"/>
+          <w:color w:val="000000" w:themeColor="text1"/>
+        </w:rPr>
         <w:t xml:space="preserve"> Sí.</w:t>
       </w:r>
     </w:p>
@@ -739,15 +1304,25 @@
           <w:ilvl w:val="0"/>
           <w:numId w:val="6"/>
         </w:numPr>
-      </w:pPr>
-      <w:r>
-        <w:rPr>
-          <w:b/>
-          <w:bCs/>
+        <w:rPr>
+          <w:rFonts w:ascii="Times New Roman" w:hAnsi="Times New Roman" w:cs="Times New Roman"/>
+          <w:color w:val="000000" w:themeColor="text1"/>
+        </w:rPr>
+      </w:pPr>
+      <w:r>
+        <w:rPr>
+          <w:rFonts w:ascii="Times New Roman" w:hAnsi="Times New Roman" w:cs="Times New Roman"/>
+          <w:b/>
+          <w:bCs/>
+          <w:color w:val="000000" w:themeColor="text1"/>
         </w:rPr>
         <w:t>Descripción del Peligro:</w:t>
       </w:r>
       <w:r>
+        <w:rPr>
+          <w:rFonts w:ascii="Times New Roman" w:hAnsi="Times New Roman" w:cs="Times New Roman"/>
+          <w:color w:val="000000" w:themeColor="text1"/>
+        </w:rPr>
         <w:t xml:space="preserve"> Iluminación deficiente en el tramo de escaleras de acceso al sótano.</w:t>
       </w:r>
     </w:p>
@@ -757,15 +1332,25 @@
           <w:ilvl w:val="0"/>
           <w:numId w:val="6"/>
         </w:numPr>
-      </w:pPr>
-      <w:r>
-        <w:rPr>
-          <w:b/>
-          <w:bCs/>
+        <w:rPr>
+          <w:rFonts w:ascii="Times New Roman" w:hAnsi="Times New Roman" w:cs="Times New Roman"/>
+          <w:color w:val="000000" w:themeColor="text1"/>
+        </w:rPr>
+      </w:pPr>
+      <w:r>
+        <w:rPr>
+          <w:rFonts w:ascii="Times New Roman" w:hAnsi="Times New Roman" w:cs="Times New Roman"/>
+          <w:b/>
+          <w:bCs/>
+          <w:color w:val="000000" w:themeColor="text1"/>
         </w:rPr>
         <w:t>Posibles Consecuencias:</w:t>
       </w:r>
       <w:r>
+        <w:rPr>
+          <w:rFonts w:ascii="Times New Roman" w:hAnsi="Times New Roman" w:cs="Times New Roman"/>
+          <w:color w:val="000000" w:themeColor="text1"/>
+        </w:rPr>
         <w:t xml:space="preserve"> Fatiga visual, tropiezos, pérdida de equilibrio y caídas.</w:t>
       </w:r>
     </w:p>
@@ -775,15 +1360,25 @@
           <w:ilvl w:val="0"/>
           <w:numId w:val="6"/>
         </w:numPr>
-      </w:pPr>
-      <w:r>
-        <w:rPr>
-          <w:b/>
-          <w:bCs/>
+        <w:rPr>
+          <w:rFonts w:ascii="Times New Roman" w:hAnsi="Times New Roman" w:cs="Times New Roman"/>
+          <w:color w:val="000000" w:themeColor="text1"/>
+        </w:rPr>
+      </w:pPr>
+      <w:r>
+        <w:rPr>
+          <w:rFonts w:ascii="Times New Roman" w:hAnsi="Times New Roman" w:cs="Times New Roman"/>
+          <w:b/>
+          <w:bCs/>
+          <w:color w:val="000000" w:themeColor="text1"/>
         </w:rPr>
         <w:t>Controles Existentes:</w:t>
       </w:r>
       <w:r>
+        <w:rPr>
+          <w:rFonts w:ascii="Times New Roman" w:hAnsi="Times New Roman" w:cs="Times New Roman"/>
+          <w:color w:val="000000" w:themeColor="text1"/>
+        </w:rPr>
         <w:t xml:space="preserve"> Ninguno (Área a oscuras).</w:t>
       </w:r>
     </w:p>
@@ -793,25 +1388,41 @@
           <w:ilvl w:val="0"/>
           <w:numId w:val="6"/>
         </w:numPr>
-      </w:pPr>
-      <w:r>
-        <w:rPr>
-          <w:b/>
-          <w:bCs/>
+        <w:rPr>
+          <w:rFonts w:ascii="Times New Roman" w:hAnsi="Times New Roman" w:cs="Times New Roman"/>
+          <w:color w:val="000000" w:themeColor="text1"/>
+        </w:rPr>
+      </w:pPr>
+      <w:r>
+        <w:rPr>
+          <w:rFonts w:ascii="Times New Roman" w:hAnsi="Times New Roman" w:cs="Times New Roman"/>
+          <w:b/>
+          <w:bCs/>
+          <w:color w:val="000000" w:themeColor="text1"/>
         </w:rPr>
         <w:t>Nivel de Riesgo (GTC 45):</w:t>
       </w:r>
       <w:r>
+        <w:rPr>
+          <w:rFonts w:ascii="Times New Roman" w:hAnsi="Times New Roman" w:cs="Times New Roman"/>
+          <w:color w:val="000000" w:themeColor="text1"/>
+        </w:rPr>
         <w:t xml:space="preserve"> </w:t>
       </w:r>
       <w:r>
         <w:rPr>
-          <w:b/>
-          <w:bCs/>
+          <w:rFonts w:ascii="Times New Roman" w:hAnsi="Times New Roman" w:cs="Times New Roman"/>
+          <w:b/>
+          <w:bCs/>
+          <w:color w:val="000000" w:themeColor="text1"/>
         </w:rPr>
         <w:t>Nivel I – ALTO</w:t>
       </w:r>
       <w:r>
+        <w:rPr>
+          <w:rFonts w:ascii="Times New Roman" w:hAnsi="Times New Roman" w:cs="Times New Roman"/>
+          <w:color w:val="000000" w:themeColor="text1"/>
+        </w:rPr>
         <w:t xml:space="preserve"> (Riesgo crítico inminente).</w:t>
       </w:r>
     </w:p>
@@ -821,15 +1432,25 @@
           <w:ilvl w:val="0"/>
           <w:numId w:val="6"/>
         </w:numPr>
-      </w:pPr>
-      <w:r>
-        <w:rPr>
-          <w:b/>
-          <w:bCs/>
+        <w:rPr>
+          <w:rFonts w:ascii="Times New Roman" w:hAnsi="Times New Roman" w:cs="Times New Roman"/>
+          <w:color w:val="000000" w:themeColor="text1"/>
+        </w:rPr>
+      </w:pPr>
+      <w:r>
+        <w:rPr>
+          <w:rFonts w:ascii="Times New Roman" w:hAnsi="Times New Roman" w:cs="Times New Roman"/>
+          <w:b/>
+          <w:bCs/>
+          <w:color w:val="000000" w:themeColor="text1"/>
         </w:rPr>
         <w:t>Medidas de Intervención (En el Medio):</w:t>
       </w:r>
       <w:r>
+        <w:rPr>
+          <w:rFonts w:ascii="Times New Roman" w:hAnsi="Times New Roman" w:cs="Times New Roman"/>
+          <w:color w:val="000000" w:themeColor="text1"/>
+        </w:rPr>
         <w:t xml:space="preserve"> Instalación inmediata de luminarias LED de alta intensidad en todo el tramo de la escalera.</w:t>
       </w:r>
     </w:p>
@@ -837,14 +1458,18 @@
       <w:pPr>
         <w:pStyle w:val="Ttulo3"/>
         <w:rPr>
-          <w:b/>
-          <w:bCs/>
-        </w:rPr>
-      </w:pPr>
-      <w:r>
-        <w:rPr>
-          <w:b/>
-          <w:bCs/>
+          <w:rFonts w:ascii="Times New Roman" w:hAnsi="Times New Roman" w:cs="Times New Roman"/>
+          <w:b/>
+          <w:bCs/>
+          <w:color w:val="000000" w:themeColor="text1"/>
+        </w:rPr>
+      </w:pPr>
+      <w:r>
+        <w:rPr>
+          <w:rFonts w:ascii="Times New Roman" w:hAnsi="Times New Roman" w:cs="Times New Roman"/>
+          <w:b/>
+          <w:bCs/>
+          <w:color w:val="000000" w:themeColor="text1"/>
         </w:rPr>
         <w:t>Riesgo 2: Peligro Locativo (Condiciones de las Escaleras)</w:t>
       </w:r>
@@ -855,15 +1480,25 @@
           <w:ilvl w:val="0"/>
           <w:numId w:val="7"/>
         </w:numPr>
-      </w:pPr>
-      <w:r>
-        <w:rPr>
-          <w:b/>
-          <w:bCs/>
+        <w:rPr>
+          <w:rFonts w:ascii="Times New Roman" w:hAnsi="Times New Roman" w:cs="Times New Roman"/>
+          <w:color w:val="000000" w:themeColor="text1"/>
+        </w:rPr>
+      </w:pPr>
+      <w:r>
+        <w:rPr>
+          <w:rFonts w:ascii="Times New Roman" w:hAnsi="Times New Roman" w:cs="Times New Roman"/>
+          <w:b/>
+          <w:bCs/>
+          <w:color w:val="000000" w:themeColor="text1"/>
         </w:rPr>
         <w:t>Proceso / Actividad:</w:t>
       </w:r>
       <w:r>
+        <w:rPr>
+          <w:rFonts w:ascii="Times New Roman" w:hAnsi="Times New Roman" w:cs="Times New Roman"/>
+          <w:color w:val="000000" w:themeColor="text1"/>
+        </w:rPr>
         <w:t xml:space="preserve"> Operativo / Tránsito peatonal por escaleras hacia el área de trabajo.</w:t>
       </w:r>
     </w:p>
@@ -873,15 +1508,25 @@
           <w:ilvl w:val="0"/>
           <w:numId w:val="7"/>
         </w:numPr>
-      </w:pPr>
-      <w:r>
-        <w:rPr>
-          <w:b/>
-          <w:bCs/>
+        <w:rPr>
+          <w:rFonts w:ascii="Times New Roman" w:hAnsi="Times New Roman" w:cs="Times New Roman"/>
+          <w:color w:val="000000" w:themeColor="text1"/>
+        </w:rPr>
+      </w:pPr>
+      <w:r>
+        <w:rPr>
+          <w:rFonts w:ascii="Times New Roman" w:hAnsi="Times New Roman" w:cs="Times New Roman"/>
+          <w:b/>
+          <w:bCs/>
+          <w:color w:val="000000" w:themeColor="text1"/>
         </w:rPr>
         <w:t>Actividad Rutinaria:</w:t>
       </w:r>
       <w:r>
+        <w:rPr>
+          <w:rFonts w:ascii="Times New Roman" w:hAnsi="Times New Roman" w:cs="Times New Roman"/>
+          <w:color w:val="000000" w:themeColor="text1"/>
+        </w:rPr>
         <w:t xml:space="preserve"> Sí.</w:t>
       </w:r>
     </w:p>
@@ -891,15 +1536,25 @@
           <w:ilvl w:val="0"/>
           <w:numId w:val="7"/>
         </w:numPr>
-      </w:pPr>
-      <w:r>
-        <w:rPr>
-          <w:b/>
-          <w:bCs/>
+        <w:rPr>
+          <w:rFonts w:ascii="Times New Roman" w:hAnsi="Times New Roman" w:cs="Times New Roman"/>
+          <w:color w:val="000000" w:themeColor="text1"/>
+        </w:rPr>
+      </w:pPr>
+      <w:r>
+        <w:rPr>
+          <w:rFonts w:ascii="Times New Roman" w:hAnsi="Times New Roman" w:cs="Times New Roman"/>
+          <w:b/>
+          <w:bCs/>
+          <w:color w:val="000000" w:themeColor="text1"/>
         </w:rPr>
         <w:t>Descripción del Peligro:</w:t>
       </w:r>
       <w:r>
+        <w:rPr>
+          <w:rFonts w:ascii="Times New Roman" w:hAnsi="Times New Roman" w:cs="Times New Roman"/>
+          <w:color w:val="000000" w:themeColor="text1"/>
+        </w:rPr>
         <w:t xml:space="preserve"> Escaleras de circulación con baja visibilidad, probable ausencia de cintas antideslizantes o bordes demarcados.</w:t>
       </w:r>
     </w:p>
@@ -909,27 +1564,53 @@
           <w:ilvl w:val="0"/>
           <w:numId w:val="7"/>
         </w:numPr>
-      </w:pPr>
-      <w:r>
-        <w:rPr>
-          <w:b/>
-          <w:bCs/>
+        <w:rPr>
+          <w:rFonts w:ascii="Times New Roman" w:hAnsi="Times New Roman" w:cs="Times New Roman"/>
+          <w:color w:val="000000" w:themeColor="text1"/>
+        </w:rPr>
+      </w:pPr>
+      <w:r>
+        <w:rPr>
+          <w:rFonts w:ascii="Times New Roman" w:hAnsi="Times New Roman" w:cs="Times New Roman"/>
+          <w:b/>
+          <w:bCs/>
+          <w:color w:val="000000" w:themeColor="text1"/>
         </w:rPr>
         <w:t>Posibles Consecuencias:</w:t>
       </w:r>
       <w:r>
+        <w:rPr>
+          <w:rFonts w:ascii="Times New Roman" w:hAnsi="Times New Roman" w:cs="Times New Roman"/>
+          <w:color w:val="000000" w:themeColor="text1"/>
+        </w:rPr>
         <w:t xml:space="preserve"> Caídas a diferente nivel, traumatismos, esguinces</w:t>
       </w:r>
       <w:r>
+        <w:rPr>
+          <w:rFonts w:ascii="Times New Roman" w:hAnsi="Times New Roman" w:cs="Times New Roman"/>
+          <w:color w:val="000000" w:themeColor="text1"/>
+        </w:rPr>
         <w:t xml:space="preserve">, </w:t>
       </w:r>
       <w:r>
+        <w:rPr>
+          <w:rFonts w:ascii="Times New Roman" w:hAnsi="Times New Roman" w:cs="Times New Roman"/>
+          <w:color w:val="000000" w:themeColor="text1"/>
+        </w:rPr>
         <w:t>fracturas de miembros</w:t>
       </w:r>
       <w:r>
+        <w:rPr>
+          <w:rFonts w:ascii="Times New Roman" w:hAnsi="Times New Roman" w:cs="Times New Roman"/>
+          <w:color w:val="000000" w:themeColor="text1"/>
+        </w:rPr>
         <w:t xml:space="preserve"> o muerte</w:t>
       </w:r>
       <w:r>
+        <w:rPr>
+          <w:rFonts w:ascii="Times New Roman" w:hAnsi="Times New Roman" w:cs="Times New Roman"/>
+          <w:color w:val="000000" w:themeColor="text1"/>
+        </w:rPr>
         <w:t>.</w:t>
       </w:r>
     </w:p>
@@ -939,15 +1620,25 @@
           <w:ilvl w:val="0"/>
           <w:numId w:val="7"/>
         </w:numPr>
-      </w:pPr>
-      <w:r>
-        <w:rPr>
-          <w:b/>
-          <w:bCs/>
+        <w:rPr>
+          <w:rFonts w:ascii="Times New Roman" w:hAnsi="Times New Roman" w:cs="Times New Roman"/>
+          <w:color w:val="000000" w:themeColor="text1"/>
+        </w:rPr>
+      </w:pPr>
+      <w:r>
+        <w:rPr>
+          <w:rFonts w:ascii="Times New Roman" w:hAnsi="Times New Roman" w:cs="Times New Roman"/>
+          <w:b/>
+          <w:bCs/>
+          <w:color w:val="000000" w:themeColor="text1"/>
         </w:rPr>
         <w:t>Controles Existentes:</w:t>
       </w:r>
       <w:r>
+        <w:rPr>
+          <w:rFonts w:ascii="Times New Roman" w:hAnsi="Times New Roman" w:cs="Times New Roman"/>
+          <w:color w:val="000000" w:themeColor="text1"/>
+        </w:rPr>
         <w:t xml:space="preserve"> Ninguno.</w:t>
       </w:r>
     </w:p>
@@ -957,25 +1648,41 @@
           <w:ilvl w:val="0"/>
           <w:numId w:val="7"/>
         </w:numPr>
-      </w:pPr>
-      <w:r>
-        <w:rPr>
-          <w:b/>
-          <w:bCs/>
+        <w:rPr>
+          <w:rFonts w:ascii="Times New Roman" w:hAnsi="Times New Roman" w:cs="Times New Roman"/>
+          <w:color w:val="000000" w:themeColor="text1"/>
+        </w:rPr>
+      </w:pPr>
+      <w:r>
+        <w:rPr>
+          <w:rFonts w:ascii="Times New Roman" w:hAnsi="Times New Roman" w:cs="Times New Roman"/>
+          <w:b/>
+          <w:bCs/>
+          <w:color w:val="000000" w:themeColor="text1"/>
         </w:rPr>
         <w:t>Nivel de Riesgo (GTC 45):</w:t>
       </w:r>
       <w:r>
+        <w:rPr>
+          <w:rFonts w:ascii="Times New Roman" w:hAnsi="Times New Roman" w:cs="Times New Roman"/>
+          <w:color w:val="000000" w:themeColor="text1"/>
+        </w:rPr>
         <w:t xml:space="preserve"> </w:t>
       </w:r>
       <w:r>
         <w:rPr>
-          <w:b/>
-          <w:bCs/>
+          <w:rFonts w:ascii="Times New Roman" w:hAnsi="Times New Roman" w:cs="Times New Roman"/>
+          <w:b/>
+          <w:bCs/>
+          <w:color w:val="000000" w:themeColor="text1"/>
         </w:rPr>
         <w:t>Nivel I – ALTO</w:t>
       </w:r>
       <w:r>
+        <w:rPr>
+          <w:rFonts w:ascii="Times New Roman" w:hAnsi="Times New Roman" w:cs="Times New Roman"/>
+          <w:color w:val="000000" w:themeColor="text1"/>
+        </w:rPr>
         <w:t xml:space="preserve"> (Accidentes recurrentes reportados).</w:t>
       </w:r>
     </w:p>
@@ -985,30 +1692,52 @@
           <w:ilvl w:val="0"/>
           <w:numId w:val="7"/>
         </w:numPr>
-      </w:pPr>
-      <w:r>
-        <w:rPr>
-          <w:b/>
-          <w:bCs/>
+        <w:rPr>
+          <w:rFonts w:ascii="Times New Roman" w:hAnsi="Times New Roman" w:cs="Times New Roman"/>
+          <w:color w:val="000000" w:themeColor="text1"/>
+        </w:rPr>
+      </w:pPr>
+      <w:r>
+        <w:rPr>
+          <w:rFonts w:ascii="Times New Roman" w:hAnsi="Times New Roman" w:cs="Times New Roman"/>
+          <w:b/>
+          <w:bCs/>
+          <w:color w:val="000000" w:themeColor="text1"/>
         </w:rPr>
         <w:t>Medidas de Intervención (En la Fuente/Medio):</w:t>
       </w:r>
       <w:r>
+        <w:rPr>
+          <w:rFonts w:ascii="Times New Roman" w:hAnsi="Times New Roman" w:cs="Times New Roman"/>
+          <w:color w:val="000000" w:themeColor="text1"/>
+        </w:rPr>
         <w:t xml:space="preserve"> Instalación de cintas antideslizantes fotoluminiscentes en las huellas de los escalones y adecuación de pasamanos continuos a ambos lados.</w:t>
       </w:r>
     </w:p>
     <w:p>
       <w:pPr>
+        <w:rPr>
+          <w:rFonts w:ascii="Times New Roman" w:hAnsi="Times New Roman" w:cs="Times New Roman"/>
+          <w:color w:val="000000" w:themeColor="text1"/>
+        </w:rPr>
+      </w:pPr>
+    </w:p>
+    <w:p>
+      <w:pPr>
         <w:pStyle w:val="Ttulo3"/>
         <w:rPr>
-          <w:b/>
-          <w:bCs/>
-        </w:rPr>
-      </w:pPr>
-      <w:r>
-        <w:rPr>
-          <w:b/>
-          <w:bCs/>
+          <w:rFonts w:ascii="Times New Roman" w:hAnsi="Times New Roman" w:cs="Times New Roman"/>
+          <w:b/>
+          <w:bCs/>
+          <w:color w:val="000000" w:themeColor="text1"/>
+        </w:rPr>
+      </w:pPr>
+      <w:r>
+        <w:rPr>
+          <w:rFonts w:ascii="Times New Roman" w:hAnsi="Times New Roman" w:cs="Times New Roman"/>
+          <w:b/>
+          <w:bCs/>
+          <w:color w:val="000000" w:themeColor="text1"/>
         </w:rPr>
         <w:lastRenderedPageBreak/>
         <w:t>Riesgo 3: Peligro Organizacional (Falla en la Gestión de SST)</w:t>
@@ -1020,15 +1749,25 @@
           <w:ilvl w:val="0"/>
           <w:numId w:val="8"/>
         </w:numPr>
-      </w:pPr>
-      <w:r>
-        <w:rPr>
-          <w:b/>
-          <w:bCs/>
+        <w:rPr>
+          <w:rFonts w:ascii="Times New Roman" w:hAnsi="Times New Roman" w:cs="Times New Roman"/>
+          <w:color w:val="000000" w:themeColor="text1"/>
+        </w:rPr>
+      </w:pPr>
+      <w:r>
+        <w:rPr>
+          <w:rFonts w:ascii="Times New Roman" w:hAnsi="Times New Roman" w:cs="Times New Roman"/>
+          <w:b/>
+          <w:bCs/>
+          <w:color w:val="000000" w:themeColor="text1"/>
         </w:rPr>
         <w:t>Proceso / Actividad:</w:t>
       </w:r>
       <w:r>
+        <w:rPr>
+          <w:rFonts w:ascii="Times New Roman" w:hAnsi="Times New Roman" w:cs="Times New Roman"/>
+          <w:color w:val="000000" w:themeColor="text1"/>
+        </w:rPr>
         <w:t xml:space="preserve"> Gestión Administrativa y SST / Reporte e inspección de condiciones inseguras.</w:t>
       </w:r>
     </w:p>
@@ -1038,15 +1777,25 @@
           <w:ilvl w:val="0"/>
           <w:numId w:val="8"/>
         </w:numPr>
-      </w:pPr>
-      <w:r>
-        <w:rPr>
-          <w:b/>
-          <w:bCs/>
+        <w:rPr>
+          <w:rFonts w:ascii="Times New Roman" w:hAnsi="Times New Roman" w:cs="Times New Roman"/>
+          <w:color w:val="000000" w:themeColor="text1"/>
+        </w:rPr>
+      </w:pPr>
+      <w:r>
+        <w:rPr>
+          <w:rFonts w:ascii="Times New Roman" w:hAnsi="Times New Roman" w:cs="Times New Roman"/>
+          <w:b/>
+          <w:bCs/>
+          <w:color w:val="000000" w:themeColor="text1"/>
         </w:rPr>
         <w:t>Actividad Rutinaria:</w:t>
       </w:r>
       <w:r>
+        <w:rPr>
+          <w:rFonts w:ascii="Times New Roman" w:hAnsi="Times New Roman" w:cs="Times New Roman"/>
+          <w:color w:val="000000" w:themeColor="text1"/>
+        </w:rPr>
         <w:t xml:space="preserve"> Sí.</w:t>
       </w:r>
     </w:p>
@@ -1056,15 +1805,25 @@
           <w:ilvl w:val="0"/>
           <w:numId w:val="8"/>
         </w:numPr>
-      </w:pPr>
-      <w:r>
-        <w:rPr>
-          <w:b/>
-          <w:bCs/>
+        <w:rPr>
+          <w:rFonts w:ascii="Times New Roman" w:hAnsi="Times New Roman" w:cs="Times New Roman"/>
+          <w:color w:val="000000" w:themeColor="text1"/>
+        </w:rPr>
+      </w:pPr>
+      <w:r>
+        <w:rPr>
+          <w:rFonts w:ascii="Times New Roman" w:hAnsi="Times New Roman" w:cs="Times New Roman"/>
+          <w:b/>
+          <w:bCs/>
+          <w:color w:val="000000" w:themeColor="text1"/>
         </w:rPr>
         <w:t>Descripción del Peligro:</w:t>
       </w:r>
       <w:r>
+        <w:rPr>
+          <w:rFonts w:ascii="Times New Roman" w:hAnsi="Times New Roman" w:cs="Times New Roman"/>
+          <w:color w:val="000000" w:themeColor="text1"/>
+        </w:rPr>
         <w:t xml:space="preserve"> Omisión o retraso en la atención de reportes de riesgo por parte del encargado del SG-SST.</w:t>
       </w:r>
     </w:p>
@@ -1074,15 +1833,25 @@
           <w:ilvl w:val="0"/>
           <w:numId w:val="8"/>
         </w:numPr>
-      </w:pPr>
-      <w:r>
-        <w:rPr>
-          <w:b/>
-          <w:bCs/>
+        <w:rPr>
+          <w:rFonts w:ascii="Times New Roman" w:hAnsi="Times New Roman" w:cs="Times New Roman"/>
+          <w:color w:val="000000" w:themeColor="text1"/>
+        </w:rPr>
+      </w:pPr>
+      <w:r>
+        <w:rPr>
+          <w:rFonts w:ascii="Times New Roman" w:hAnsi="Times New Roman" w:cs="Times New Roman"/>
+          <w:b/>
+          <w:bCs/>
+          <w:color w:val="000000" w:themeColor="text1"/>
         </w:rPr>
         <w:t>Posibles Consecuencias:</w:t>
       </w:r>
       <w:r>
+        <w:rPr>
+          <w:rFonts w:ascii="Times New Roman" w:hAnsi="Times New Roman" w:cs="Times New Roman"/>
+          <w:color w:val="000000" w:themeColor="text1"/>
+        </w:rPr>
         <w:t xml:space="preserve"> Materialización de Accidentes de Trabajo (AT) por falta de acciones correctivas oportunas.</w:t>
       </w:r>
     </w:p>
@@ -1092,15 +1861,25 @@
           <w:ilvl w:val="0"/>
           <w:numId w:val="8"/>
         </w:numPr>
-      </w:pPr>
-      <w:r>
-        <w:rPr>
-          <w:b/>
-          <w:bCs/>
+        <w:rPr>
+          <w:rFonts w:ascii="Times New Roman" w:hAnsi="Times New Roman" w:cs="Times New Roman"/>
+          <w:color w:val="000000" w:themeColor="text1"/>
+        </w:rPr>
+      </w:pPr>
+      <w:r>
+        <w:rPr>
+          <w:rFonts w:ascii="Times New Roman" w:hAnsi="Times New Roman" w:cs="Times New Roman"/>
+          <w:b/>
+          <w:bCs/>
+          <w:color w:val="000000" w:themeColor="text1"/>
         </w:rPr>
         <w:t>Controles Existentes:</w:t>
       </w:r>
       <w:r>
+        <w:rPr>
+          <w:rFonts w:ascii="Times New Roman" w:hAnsi="Times New Roman" w:cs="Times New Roman"/>
+          <w:color w:val="000000" w:themeColor="text1"/>
+        </w:rPr>
         <w:t xml:space="preserve"> Ninguno (Reporte previo sin atención).</w:t>
       </w:r>
     </w:p>
@@ -1110,25 +1889,41 @@
           <w:ilvl w:val="0"/>
           <w:numId w:val="8"/>
         </w:numPr>
-      </w:pPr>
-      <w:r>
-        <w:rPr>
-          <w:b/>
-          <w:bCs/>
+        <w:rPr>
+          <w:rFonts w:ascii="Times New Roman" w:hAnsi="Times New Roman" w:cs="Times New Roman"/>
+          <w:color w:val="000000" w:themeColor="text1"/>
+        </w:rPr>
+      </w:pPr>
+      <w:r>
+        <w:rPr>
+          <w:rFonts w:ascii="Times New Roman" w:hAnsi="Times New Roman" w:cs="Times New Roman"/>
+          <w:b/>
+          <w:bCs/>
+          <w:color w:val="000000" w:themeColor="text1"/>
         </w:rPr>
         <w:t>Nivel de Riesgo (GTC 45):</w:t>
       </w:r>
       <w:r>
+        <w:rPr>
+          <w:rFonts w:ascii="Times New Roman" w:hAnsi="Times New Roman" w:cs="Times New Roman"/>
+          <w:color w:val="000000" w:themeColor="text1"/>
+        </w:rPr>
         <w:t xml:space="preserve"> </w:t>
       </w:r>
       <w:r>
         <w:rPr>
-          <w:b/>
-          <w:bCs/>
+          <w:rFonts w:ascii="Times New Roman" w:hAnsi="Times New Roman" w:cs="Times New Roman"/>
+          <w:b/>
+          <w:bCs/>
+          <w:color w:val="000000" w:themeColor="text1"/>
         </w:rPr>
         <w:t>Nivel II – MEDIO</w:t>
       </w:r>
       <w:r>
+        <w:rPr>
+          <w:rFonts w:ascii="Times New Roman" w:hAnsi="Times New Roman" w:cs="Times New Roman"/>
+          <w:color w:val="000000" w:themeColor="text1"/>
+        </w:rPr>
         <w:t xml:space="preserve"> (Falla de control administrativo).</w:t>
       </w:r>
     </w:p>
@@ -1138,64 +1933,194 @@
           <w:ilvl w:val="0"/>
           <w:numId w:val="8"/>
         </w:numPr>
-      </w:pPr>
-      <w:r>
-        <w:rPr>
-          <w:b/>
-          <w:bCs/>
+        <w:rPr>
+          <w:rFonts w:ascii="Times New Roman" w:hAnsi="Times New Roman" w:cs="Times New Roman"/>
+          <w:color w:val="000000" w:themeColor="text1"/>
+        </w:rPr>
+      </w:pPr>
+      <w:r>
+        <w:rPr>
+          <w:rFonts w:ascii="Times New Roman" w:hAnsi="Times New Roman" w:cs="Times New Roman"/>
+          <w:b/>
+          <w:bCs/>
+          <w:color w:val="000000" w:themeColor="text1"/>
         </w:rPr>
         <w:t>Medidas de Intervención (Control Administrativo):</w:t>
       </w:r>
       <w:r>
+        <w:rPr>
+          <w:rFonts w:ascii="Times New Roman" w:hAnsi="Times New Roman" w:cs="Times New Roman"/>
+          <w:color w:val="000000" w:themeColor="text1"/>
+        </w:rPr>
         <w:t xml:space="preserve"> Establecer un procedimiento con tiempo máximo de respuesta (24 a 48 horas) para intervención de hallazgos reportados.</w:t>
       </w:r>
     </w:p>
-    <w:p/>
-    <w:p/>
-    <w:p/>
-    <w:p/>
-    <w:p/>
-    <w:p/>
-    <w:p/>
-    <w:p/>
-    <w:p/>
-    <w:p/>
-    <w:p/>
-    <w:p/>
-    <w:p/>
-    <w:p/>
-    <w:p/>
+    <w:p>
+      <w:pPr>
+        <w:rPr>
+          <w:rFonts w:ascii="Times New Roman" w:hAnsi="Times New Roman" w:cs="Times New Roman"/>
+          <w:color w:val="000000" w:themeColor="text1"/>
+        </w:rPr>
+      </w:pPr>
+    </w:p>
+    <w:p>
+      <w:pPr>
+        <w:rPr>
+          <w:rFonts w:ascii="Times New Roman" w:hAnsi="Times New Roman" w:cs="Times New Roman"/>
+          <w:color w:val="000000" w:themeColor="text1"/>
+        </w:rPr>
+      </w:pPr>
+    </w:p>
+    <w:p>
+      <w:pPr>
+        <w:rPr>
+          <w:rFonts w:ascii="Times New Roman" w:hAnsi="Times New Roman" w:cs="Times New Roman"/>
+          <w:color w:val="000000" w:themeColor="text1"/>
+        </w:rPr>
+      </w:pPr>
+    </w:p>
+    <w:p>
+      <w:pPr>
+        <w:rPr>
+          <w:rFonts w:ascii="Times New Roman" w:hAnsi="Times New Roman" w:cs="Times New Roman"/>
+          <w:color w:val="000000" w:themeColor="text1"/>
+        </w:rPr>
+      </w:pPr>
+    </w:p>
+    <w:p>
+      <w:pPr>
+        <w:rPr>
+          <w:rFonts w:ascii="Times New Roman" w:hAnsi="Times New Roman" w:cs="Times New Roman"/>
+          <w:color w:val="000000" w:themeColor="text1"/>
+        </w:rPr>
+      </w:pPr>
+    </w:p>
+    <w:p>
+      <w:pPr>
+        <w:rPr>
+          <w:rFonts w:ascii="Times New Roman" w:hAnsi="Times New Roman" w:cs="Times New Roman"/>
+          <w:color w:val="000000" w:themeColor="text1"/>
+        </w:rPr>
+      </w:pPr>
+    </w:p>
+    <w:p>
+      <w:pPr>
+        <w:rPr>
+          <w:rFonts w:ascii="Times New Roman" w:hAnsi="Times New Roman" w:cs="Times New Roman"/>
+          <w:color w:val="000000" w:themeColor="text1"/>
+        </w:rPr>
+      </w:pPr>
+    </w:p>
+    <w:p>
+      <w:pPr>
+        <w:rPr>
+          <w:rFonts w:ascii="Times New Roman" w:hAnsi="Times New Roman" w:cs="Times New Roman"/>
+          <w:color w:val="000000" w:themeColor="text1"/>
+        </w:rPr>
+      </w:pPr>
+    </w:p>
+    <w:p>
+      <w:pPr>
+        <w:rPr>
+          <w:rFonts w:ascii="Times New Roman" w:hAnsi="Times New Roman" w:cs="Times New Roman"/>
+          <w:color w:val="000000" w:themeColor="text1"/>
+        </w:rPr>
+      </w:pPr>
+    </w:p>
+    <w:p>
+      <w:pPr>
+        <w:rPr>
+          <w:rFonts w:ascii="Times New Roman" w:hAnsi="Times New Roman" w:cs="Times New Roman"/>
+          <w:color w:val="000000" w:themeColor="text1"/>
+        </w:rPr>
+      </w:pPr>
+    </w:p>
+    <w:p>
+      <w:pPr>
+        <w:rPr>
+          <w:rFonts w:ascii="Times New Roman" w:hAnsi="Times New Roman" w:cs="Times New Roman"/>
+          <w:color w:val="000000" w:themeColor="text1"/>
+        </w:rPr>
+      </w:pPr>
+    </w:p>
+    <w:p>
+      <w:pPr>
+        <w:rPr>
+          <w:rFonts w:ascii="Times New Roman" w:hAnsi="Times New Roman" w:cs="Times New Roman"/>
+          <w:color w:val="000000" w:themeColor="text1"/>
+        </w:rPr>
+      </w:pPr>
+    </w:p>
+    <w:p>
+      <w:pPr>
+        <w:rPr>
+          <w:rFonts w:ascii="Times New Roman" w:hAnsi="Times New Roman" w:cs="Times New Roman"/>
+          <w:color w:val="000000" w:themeColor="text1"/>
+        </w:rPr>
+      </w:pPr>
+    </w:p>
+    <w:p>
+      <w:pPr>
+        <w:rPr>
+          <w:rFonts w:ascii="Times New Roman" w:hAnsi="Times New Roman" w:cs="Times New Roman"/>
+          <w:color w:val="000000" w:themeColor="text1"/>
+        </w:rPr>
+      </w:pPr>
+    </w:p>
+    <w:p>
+      <w:pPr>
+        <w:rPr>
+          <w:rFonts w:ascii="Times New Roman" w:hAnsi="Times New Roman" w:cs="Times New Roman"/>
+          <w:color w:val="000000" w:themeColor="text1"/>
+        </w:rPr>
+      </w:pPr>
+    </w:p>
     <w:p>
       <w:pPr>
         <w:pStyle w:val="Ttulo2"/>
         <w:jc w:val="center"/>
         <w:rPr>
-          <w:b/>
-          <w:bCs/>
-        </w:rPr>
-      </w:pPr>
-      <w:r>
-        <w:rPr>
-          <w:b/>
-          <w:bCs/>
+          <w:rFonts w:ascii="Times New Roman" w:hAnsi="Times New Roman" w:cs="Times New Roman"/>
+          <w:b/>
+          <w:bCs/>
+          <w:color w:val="000000" w:themeColor="text1"/>
+        </w:rPr>
+      </w:pPr>
+      <w:r>
+        <w:rPr>
+          <w:rFonts w:ascii="Times New Roman" w:hAnsi="Times New Roman" w:cs="Times New Roman"/>
+          <w:b/>
+          <w:bCs/>
+          <w:color w:val="000000" w:themeColor="text1"/>
         </w:rPr>
         <w:lastRenderedPageBreak/>
         <w:t>4. Conclusiones y Recomendaciones</w:t>
       </w:r>
     </w:p>
-    <w:p/>
+    <w:p>
+      <w:pPr>
+        <w:rPr>
+          <w:rFonts w:ascii="Times New Roman" w:hAnsi="Times New Roman" w:cs="Times New Roman"/>
+          <w:color w:val="000000" w:themeColor="text1"/>
+        </w:rPr>
+      </w:pPr>
+    </w:p>
     <w:p>
       <w:pPr>
         <w:pStyle w:val="Ttulo3"/>
         <w:rPr>
-          <w:b/>
-          <w:bCs/>
-        </w:rPr>
-      </w:pPr>
-      <w:r>
-        <w:rPr>
-          <w:b/>
-          <w:bCs/>
+          <w:rFonts w:ascii="Times New Roman" w:hAnsi="Times New Roman" w:cs="Times New Roman"/>
+          <w:b/>
+          <w:bCs/>
+          <w:color w:val="000000" w:themeColor="text1"/>
+        </w:rPr>
+      </w:pPr>
+      <w:r>
+        <w:rPr>
+          <w:rFonts w:ascii="Times New Roman" w:hAnsi="Times New Roman" w:cs="Times New Roman"/>
+          <w:b/>
+          <w:bCs/>
+          <w:color w:val="000000" w:themeColor="text1"/>
         </w:rPr>
         <w:t>4.1. Conclusiones</w:t>
       </w:r>
@@ -1206,25 +2131,41 @@
           <w:ilvl w:val="0"/>
           <w:numId w:val="9"/>
         </w:numPr>
-      </w:pPr>
-      <w:r>
-        <w:rPr>
-          <w:b/>
-          <w:bCs/>
+        <w:rPr>
+          <w:rFonts w:ascii="Times New Roman" w:hAnsi="Times New Roman" w:cs="Times New Roman"/>
+          <w:color w:val="000000" w:themeColor="text1"/>
+        </w:rPr>
+      </w:pPr>
+      <w:r>
+        <w:rPr>
+          <w:rFonts w:ascii="Times New Roman" w:hAnsi="Times New Roman" w:cs="Times New Roman"/>
+          <w:b/>
+          <w:bCs/>
+          <w:color w:val="000000" w:themeColor="text1"/>
         </w:rPr>
         <w:t>Incumplimiento Preventivo:</w:t>
       </w:r>
       <w:r>
+        <w:rPr>
+          <w:rFonts w:ascii="Times New Roman" w:hAnsi="Times New Roman" w:cs="Times New Roman"/>
+          <w:color w:val="000000" w:themeColor="text1"/>
+        </w:rPr>
         <w:t xml:space="preserve"> La empresa </w:t>
       </w:r>
       <w:r>
         <w:rPr>
-          <w:b/>
-          <w:bCs/>
+          <w:rFonts w:ascii="Times New Roman" w:hAnsi="Times New Roman" w:cs="Times New Roman"/>
+          <w:b/>
+          <w:bCs/>
+          <w:color w:val="000000" w:themeColor="text1"/>
         </w:rPr>
         <w:t>Vestidos y Costuras S.A.S.</w:t>
       </w:r>
       <w:r>
+        <w:rPr>
+          <w:rFonts w:ascii="Times New Roman" w:hAnsi="Times New Roman" w:cs="Times New Roman"/>
+          <w:color w:val="000000" w:themeColor="text1"/>
+        </w:rPr>
         <w:t xml:space="preserve"> presenta una falla crítica en su Sistema de Gestión de Seguridad y Salud en el Trabajo (SG-SST) al no atender oportunamente los reportes de condiciones inseguras expresados por los operarios, exponiéndolos de manera directa a un Accidente de Trabajo (AT).</w:t>
       </w:r>
     </w:p>
@@ -1234,35 +2175,57 @@
           <w:ilvl w:val="0"/>
           <w:numId w:val="9"/>
         </w:numPr>
-      </w:pPr>
-      <w:r>
-        <w:rPr>
-          <w:b/>
-          <w:bCs/>
+        <w:rPr>
+          <w:rFonts w:ascii="Times New Roman" w:hAnsi="Times New Roman" w:cs="Times New Roman"/>
+          <w:color w:val="000000" w:themeColor="text1"/>
+        </w:rPr>
+      </w:pPr>
+      <w:r>
+        <w:rPr>
+          <w:rFonts w:ascii="Times New Roman" w:hAnsi="Times New Roman" w:cs="Times New Roman"/>
+          <w:b/>
+          <w:bCs/>
+          <w:color w:val="000000" w:themeColor="text1"/>
         </w:rPr>
         <w:t>Interacción de Peligros:</w:t>
       </w:r>
       <w:r>
+        <w:rPr>
+          <w:rFonts w:ascii="Times New Roman" w:hAnsi="Times New Roman" w:cs="Times New Roman"/>
+          <w:color w:val="000000" w:themeColor="text1"/>
+        </w:rPr>
         <w:t xml:space="preserve"> En el acceso al sótano coinciden dos factores de riesgo de alta gravedad: un </w:t>
       </w:r>
       <w:r>
         <w:rPr>
-          <w:b/>
-          <w:bCs/>
+          <w:rFonts w:ascii="Times New Roman" w:hAnsi="Times New Roman" w:cs="Times New Roman"/>
+          <w:b/>
+          <w:bCs/>
+          <w:color w:val="000000" w:themeColor="text1"/>
         </w:rPr>
         <w:t>peligro físico</w:t>
       </w:r>
       <w:r>
+        <w:rPr>
+          <w:rFonts w:ascii="Times New Roman" w:hAnsi="Times New Roman" w:cs="Times New Roman"/>
+          <w:color w:val="000000" w:themeColor="text1"/>
+        </w:rPr>
         <w:t xml:space="preserve"> (iluminación deficiente) que altera la capacidad visual del operario, y un </w:t>
       </w:r>
       <w:r>
         <w:rPr>
-          <w:b/>
-          <w:bCs/>
+          <w:rFonts w:ascii="Times New Roman" w:hAnsi="Times New Roman" w:cs="Times New Roman"/>
+          <w:b/>
+          <w:bCs/>
+          <w:color w:val="000000" w:themeColor="text1"/>
         </w:rPr>
         <w:t>peligro locativo</w:t>
       </w:r>
       <w:r>
+        <w:rPr>
+          <w:rFonts w:ascii="Times New Roman" w:hAnsi="Times New Roman" w:cs="Times New Roman"/>
+          <w:color w:val="000000" w:themeColor="text1"/>
+        </w:rPr>
         <w:t xml:space="preserve"> (escaleras de tránsito), lo que incrementa exponencialmente la probabilidad de sufrir caídas a diferente nivel con consecuencias como fracturas o esguinces.</w:t>
       </w:r>
     </w:p>
@@ -1272,15 +2235,25 @@
           <w:ilvl w:val="0"/>
           <w:numId w:val="9"/>
         </w:numPr>
-      </w:pPr>
-      <w:r>
-        <w:rPr>
-          <w:b/>
-          <w:bCs/>
+        <w:rPr>
+          <w:rFonts w:ascii="Times New Roman" w:hAnsi="Times New Roman" w:cs="Times New Roman"/>
+          <w:color w:val="000000" w:themeColor="text1"/>
+        </w:rPr>
+      </w:pPr>
+      <w:r>
+        <w:rPr>
+          <w:rFonts w:ascii="Times New Roman" w:hAnsi="Times New Roman" w:cs="Times New Roman"/>
+          <w:b/>
+          <w:bCs/>
+          <w:color w:val="000000" w:themeColor="text1"/>
         </w:rPr>
         <w:t>Responsabilidad Legal:</w:t>
       </w:r>
       <w:r>
+        <w:rPr>
+          <w:rFonts w:ascii="Times New Roman" w:hAnsi="Times New Roman" w:cs="Times New Roman"/>
+          <w:color w:val="000000" w:themeColor="text1"/>
+        </w:rPr>
         <w:t xml:space="preserve"> De acuerdo con el Decreto 1072 de 2015, la alta dirección y el responsable de SST deben priorizar la intervención de los peligros que amenacen la integridad de los trabajadores para evitar sanciones administrativas o responsabilidades civiles.</w:t>
       </w:r>
     </w:p>
@@ -1288,20 +2261,34 @@
       <w:pPr>
         <w:pStyle w:val="Ttulo3"/>
         <w:rPr>
-          <w:b/>
-          <w:bCs/>
-        </w:rPr>
-      </w:pPr>
-      <w:r>
-        <w:rPr>
-          <w:b/>
-          <w:bCs/>
+          <w:rFonts w:ascii="Times New Roman" w:hAnsi="Times New Roman" w:cs="Times New Roman"/>
+          <w:b/>
+          <w:bCs/>
+          <w:color w:val="000000" w:themeColor="text1"/>
+        </w:rPr>
+      </w:pPr>
+      <w:r>
+        <w:rPr>
+          <w:rFonts w:ascii="Times New Roman" w:hAnsi="Times New Roman" w:cs="Times New Roman"/>
+          <w:b/>
+          <w:bCs/>
+          <w:color w:val="000000" w:themeColor="text1"/>
         </w:rPr>
         <w:t>4.2. Plan de Recomendaciones e Intervención Sugerido</w:t>
       </w:r>
     </w:p>
     <w:p>
-      <w:r>
+      <w:pPr>
+        <w:rPr>
+          <w:rFonts w:ascii="Times New Roman" w:hAnsi="Times New Roman" w:cs="Times New Roman"/>
+          <w:color w:val="000000" w:themeColor="text1"/>
+        </w:rPr>
+      </w:pPr>
+      <w:r>
+        <w:rPr>
+          <w:rFonts w:ascii="Times New Roman" w:hAnsi="Times New Roman" w:cs="Times New Roman"/>
+          <w:color w:val="000000" w:themeColor="text1"/>
+        </w:rPr>
         <w:t>Para mitigar los riesgos identificados en el análisis del caso, se sugieren las siguientes acciones divididas según la jerarquía de controles:</w:t>
       </w:r>
     </w:p>
@@ -1311,11 +2298,17 @@
           <w:ilvl w:val="0"/>
           <w:numId w:val="10"/>
         </w:numPr>
-      </w:pPr>
-      <w:r>
-        <w:rPr>
-          <w:b/>
-          <w:bCs/>
+        <w:rPr>
+          <w:rFonts w:ascii="Times New Roman" w:hAnsi="Times New Roman" w:cs="Times New Roman"/>
+          <w:color w:val="000000" w:themeColor="text1"/>
+        </w:rPr>
+      </w:pPr>
+      <w:r>
+        <w:rPr>
+          <w:rFonts w:ascii="Times New Roman" w:hAnsi="Times New Roman" w:cs="Times New Roman"/>
+          <w:b/>
+          <w:bCs/>
+          <w:color w:val="000000" w:themeColor="text1"/>
         </w:rPr>
         <w:t>Controles en el Medio (Infraestructura e Iluminación):</w:t>
       </w:r>
@@ -1326,8 +2319,16 @@
           <w:ilvl w:val="1"/>
           <w:numId w:val="10"/>
         </w:numPr>
-      </w:pPr>
-      <w:r>
+        <w:rPr>
+          <w:rFonts w:ascii="Times New Roman" w:hAnsi="Times New Roman" w:cs="Times New Roman"/>
+          <w:color w:val="000000" w:themeColor="text1"/>
+        </w:rPr>
+      </w:pPr>
+      <w:r>
+        <w:rPr>
+          <w:rFonts w:ascii="Times New Roman" w:hAnsi="Times New Roman" w:cs="Times New Roman"/>
+          <w:color w:val="000000" w:themeColor="text1"/>
+        </w:rPr>
         <w:t>Realizar la instalación inmediata de luminarias LED de alta potencia en el tramo completo de las escaleras de acceso al sótano, garantizando los niveles mínimos de luxes exigidos por la Resolución 2400 de 1979.</w:t>
       </w:r>
     </w:p>
@@ -1337,8 +2338,16 @@
           <w:ilvl w:val="1"/>
           <w:numId w:val="10"/>
         </w:numPr>
-      </w:pPr>
-      <w:r>
+        <w:rPr>
+          <w:rFonts w:ascii="Times New Roman" w:hAnsi="Times New Roman" w:cs="Times New Roman"/>
+          <w:color w:val="000000" w:themeColor="text1"/>
+        </w:rPr>
+      </w:pPr>
+      <w:r>
+        <w:rPr>
+          <w:rFonts w:ascii="Times New Roman" w:hAnsi="Times New Roman" w:cs="Times New Roman"/>
+          <w:color w:val="000000" w:themeColor="text1"/>
+        </w:rPr>
         <w:t>Colocar cintas antideslizantes fotoluminiscentes en las huellas de cada escalón para facilitar la visibilidad de los bordes, incluso en situaciones de corte de energía.</w:t>
       </w:r>
     </w:p>
@@ -1348,10 +2357,50 @@
           <w:ilvl w:val="1"/>
           <w:numId w:val="10"/>
         </w:numPr>
-      </w:pPr>
-      <w:r>
+        <w:rPr>
+          <w:rFonts w:ascii="Times New Roman" w:hAnsi="Times New Roman" w:cs="Times New Roman"/>
+          <w:color w:val="000000" w:themeColor="text1"/>
+        </w:rPr>
+      </w:pPr>
+      <w:r>
+        <w:rPr>
+          <w:rFonts w:ascii="Times New Roman" w:hAnsi="Times New Roman" w:cs="Times New Roman"/>
+          <w:color w:val="000000" w:themeColor="text1"/>
+        </w:rPr>
         <w:t>Verificar la presencia, altura y firmeza de pasamanos continuos a ambos lados de la escalera.</w:t>
       </w:r>
+    </w:p>
+    <w:p>
+      <w:pPr>
+        <w:rPr>
+          <w:rFonts w:ascii="Times New Roman" w:hAnsi="Times New Roman" w:cs="Times New Roman"/>
+          <w:color w:val="000000" w:themeColor="text1"/>
+        </w:rPr>
+      </w:pPr>
+    </w:p>
+    <w:p>
+      <w:pPr>
+        <w:rPr>
+          <w:rFonts w:ascii="Times New Roman" w:hAnsi="Times New Roman" w:cs="Times New Roman"/>
+          <w:color w:val="000000" w:themeColor="text1"/>
+        </w:rPr>
+      </w:pPr>
+    </w:p>
+    <w:p>
+      <w:pPr>
+        <w:rPr>
+          <w:rFonts w:ascii="Times New Roman" w:hAnsi="Times New Roman" w:cs="Times New Roman"/>
+          <w:color w:val="000000" w:themeColor="text1"/>
+        </w:rPr>
+      </w:pPr>
+    </w:p>
+    <w:p>
+      <w:pPr>
+        <w:rPr>
+          <w:rFonts w:ascii="Times New Roman" w:hAnsi="Times New Roman" w:cs="Times New Roman"/>
+          <w:color w:val="000000" w:themeColor="text1"/>
+        </w:rPr>
+      </w:pPr>
     </w:p>
     <w:p>
       <w:pPr>
@@ -1359,12 +2408,19 @@
           <w:ilvl w:val="0"/>
           <w:numId w:val="10"/>
         </w:numPr>
-      </w:pPr>
-      <w:r>
-        <w:rPr>
-          <w:b/>
-          <w:bCs/>
-        </w:rPr>
+        <w:rPr>
+          <w:rFonts w:ascii="Times New Roman" w:hAnsi="Times New Roman" w:cs="Times New Roman"/>
+          <w:color w:val="000000" w:themeColor="text1"/>
+        </w:rPr>
+      </w:pPr>
+      <w:r>
+        <w:rPr>
+          <w:rFonts w:ascii="Times New Roman" w:hAnsi="Times New Roman" w:cs="Times New Roman"/>
+          <w:b/>
+          <w:bCs/>
+          <w:color w:val="000000" w:themeColor="text1"/>
+        </w:rPr>
+        <w:lastRenderedPageBreak/>
         <w:t>Controles Administrativos y de Gestión:</w:t>
       </w:r>
     </w:p>
@@ -1374,16 +2430,25 @@
           <w:ilvl w:val="1"/>
           <w:numId w:val="10"/>
         </w:numPr>
-      </w:pPr>
-      <w:r>
-        <w:rPr>
-          <w:b/>
-          <w:bCs/>
-        </w:rPr>
-        <w:lastRenderedPageBreak/>
+        <w:rPr>
+          <w:rFonts w:ascii="Times New Roman" w:hAnsi="Times New Roman" w:cs="Times New Roman"/>
+          <w:color w:val="000000" w:themeColor="text1"/>
+        </w:rPr>
+      </w:pPr>
+      <w:r>
+        <w:rPr>
+          <w:rFonts w:ascii="Times New Roman" w:hAnsi="Times New Roman" w:cs="Times New Roman"/>
+          <w:b/>
+          <w:bCs/>
+          <w:color w:val="000000" w:themeColor="text1"/>
+        </w:rPr>
         <w:t>Atención Inmediata al Reporte:</w:t>
       </w:r>
       <w:r>
+        <w:rPr>
+          <w:rFonts w:ascii="Times New Roman" w:hAnsi="Times New Roman" w:cs="Times New Roman"/>
+          <w:color w:val="000000" w:themeColor="text1"/>
+        </w:rPr>
         <w:t xml:space="preserve"> Establecer un protocolo formal de respuesta a reportes de condiciones inseguras con un tiempo máximo de intervención de 24 a 48 horas para hallazgos de riesgo alto.</w:t>
       </w:r>
     </w:p>
@@ -1393,15 +2458,25 @@
           <w:ilvl w:val="1"/>
           <w:numId w:val="10"/>
         </w:numPr>
-      </w:pPr>
-      <w:r>
-        <w:rPr>
-          <w:b/>
-          <w:bCs/>
+        <w:rPr>
+          <w:rFonts w:ascii="Times New Roman" w:hAnsi="Times New Roman" w:cs="Times New Roman"/>
+          <w:color w:val="000000" w:themeColor="text1"/>
+        </w:rPr>
+      </w:pPr>
+      <w:r>
+        <w:rPr>
+          <w:rFonts w:ascii="Times New Roman" w:hAnsi="Times New Roman" w:cs="Times New Roman"/>
+          <w:b/>
+          <w:bCs/>
+          <w:color w:val="000000" w:themeColor="text1"/>
         </w:rPr>
         <w:t>Inspecciones Planeadas:</w:t>
       </w:r>
       <w:r>
+        <w:rPr>
+          <w:rFonts w:ascii="Times New Roman" w:hAnsi="Times New Roman" w:cs="Times New Roman"/>
+          <w:color w:val="000000" w:themeColor="text1"/>
+        </w:rPr>
         <w:t xml:space="preserve"> Programar inspecciones periódicas de condiciones locativas e iluminación en conjunto con el COPASST (Comité Paritario de Seguridad y Salud en el Trabajo).</w:t>
       </w:r>
     </w:p>
@@ -1411,11 +2486,17 @@
           <w:ilvl w:val="0"/>
           <w:numId w:val="10"/>
         </w:numPr>
-      </w:pPr>
-      <w:r>
-        <w:rPr>
-          <w:b/>
-          <w:bCs/>
+        <w:rPr>
+          <w:rFonts w:ascii="Times New Roman" w:hAnsi="Times New Roman" w:cs="Times New Roman"/>
+          <w:color w:val="000000" w:themeColor="text1"/>
+        </w:rPr>
+      </w:pPr>
+      <w:r>
+        <w:rPr>
+          <w:rFonts w:ascii="Times New Roman" w:hAnsi="Times New Roman" w:cs="Times New Roman"/>
+          <w:b/>
+          <w:bCs/>
+          <w:color w:val="000000" w:themeColor="text1"/>
         </w:rPr>
         <w:t>Controles en el Individuo (Capacitación y Autocuidado):</w:t>
       </w:r>
@@ -1426,65 +2507,217 @@
           <w:ilvl w:val="1"/>
           <w:numId w:val="10"/>
         </w:numPr>
-      </w:pPr>
-      <w:r>
+        <w:rPr>
+          <w:rFonts w:ascii="Times New Roman" w:hAnsi="Times New Roman" w:cs="Times New Roman"/>
+          <w:color w:val="000000" w:themeColor="text1"/>
+        </w:rPr>
+      </w:pPr>
+      <w:r>
+        <w:rPr>
+          <w:rFonts w:ascii="Times New Roman" w:hAnsi="Times New Roman" w:cs="Times New Roman"/>
+          <w:color w:val="000000" w:themeColor="text1"/>
+        </w:rPr>
         <w:t>Socializar con el personal de operarios de las máquinas bordadoras la importancia del uso correcto de pasamanos y la prohibición de transportar cargas innecesarias que obstruyan la visibilidad al bajar al sótano.</w:t>
       </w:r>
     </w:p>
-    <w:p/>
-    <w:p/>
-    <w:p/>
-    <w:p/>
-    <w:p/>
-    <w:p/>
-    <w:p/>
-    <w:p/>
-    <w:p/>
-    <w:p/>
-    <w:p/>
-    <w:p/>
-    <w:p/>
-    <w:p/>
-    <w:p/>
-    <w:p/>
-    <w:p/>
+    <w:p>
+      <w:pPr>
+        <w:rPr>
+          <w:rFonts w:ascii="Times New Roman" w:hAnsi="Times New Roman" w:cs="Times New Roman"/>
+          <w:color w:val="000000" w:themeColor="text1"/>
+        </w:rPr>
+      </w:pPr>
+    </w:p>
+    <w:p>
+      <w:pPr>
+        <w:rPr>
+          <w:rFonts w:ascii="Times New Roman" w:hAnsi="Times New Roman" w:cs="Times New Roman"/>
+          <w:color w:val="000000" w:themeColor="text1"/>
+        </w:rPr>
+      </w:pPr>
+    </w:p>
+    <w:p>
+      <w:pPr>
+        <w:rPr>
+          <w:rFonts w:ascii="Times New Roman" w:hAnsi="Times New Roman" w:cs="Times New Roman"/>
+          <w:color w:val="000000" w:themeColor="text1"/>
+        </w:rPr>
+      </w:pPr>
+    </w:p>
+    <w:p>
+      <w:pPr>
+        <w:rPr>
+          <w:rFonts w:ascii="Times New Roman" w:hAnsi="Times New Roman" w:cs="Times New Roman"/>
+          <w:color w:val="000000" w:themeColor="text1"/>
+        </w:rPr>
+      </w:pPr>
+    </w:p>
+    <w:p>
+      <w:pPr>
+        <w:rPr>
+          <w:rFonts w:ascii="Times New Roman" w:hAnsi="Times New Roman" w:cs="Times New Roman"/>
+          <w:color w:val="000000" w:themeColor="text1"/>
+        </w:rPr>
+      </w:pPr>
+    </w:p>
+    <w:p>
+      <w:pPr>
+        <w:rPr>
+          <w:rFonts w:ascii="Times New Roman" w:hAnsi="Times New Roman" w:cs="Times New Roman"/>
+          <w:color w:val="000000" w:themeColor="text1"/>
+        </w:rPr>
+      </w:pPr>
+    </w:p>
+    <w:p>
+      <w:pPr>
+        <w:rPr>
+          <w:rFonts w:ascii="Times New Roman" w:hAnsi="Times New Roman" w:cs="Times New Roman"/>
+          <w:color w:val="000000" w:themeColor="text1"/>
+        </w:rPr>
+      </w:pPr>
+    </w:p>
+    <w:p>
+      <w:pPr>
+        <w:rPr>
+          <w:rFonts w:ascii="Times New Roman" w:hAnsi="Times New Roman" w:cs="Times New Roman"/>
+          <w:color w:val="000000" w:themeColor="text1"/>
+        </w:rPr>
+      </w:pPr>
+    </w:p>
+    <w:p>
+      <w:pPr>
+        <w:rPr>
+          <w:rFonts w:ascii="Times New Roman" w:hAnsi="Times New Roman" w:cs="Times New Roman"/>
+          <w:color w:val="000000" w:themeColor="text1"/>
+        </w:rPr>
+      </w:pPr>
+    </w:p>
+    <w:p>
+      <w:pPr>
+        <w:rPr>
+          <w:rFonts w:ascii="Times New Roman" w:hAnsi="Times New Roman" w:cs="Times New Roman"/>
+          <w:color w:val="000000" w:themeColor="text1"/>
+        </w:rPr>
+      </w:pPr>
+    </w:p>
+    <w:p>
+      <w:pPr>
+        <w:rPr>
+          <w:rFonts w:ascii="Times New Roman" w:hAnsi="Times New Roman" w:cs="Times New Roman"/>
+          <w:color w:val="000000" w:themeColor="text1"/>
+        </w:rPr>
+      </w:pPr>
+    </w:p>
+    <w:p>
+      <w:pPr>
+        <w:rPr>
+          <w:rFonts w:ascii="Times New Roman" w:hAnsi="Times New Roman" w:cs="Times New Roman"/>
+          <w:color w:val="000000" w:themeColor="text1"/>
+        </w:rPr>
+      </w:pPr>
+    </w:p>
+    <w:p>
+      <w:pPr>
+        <w:rPr>
+          <w:rFonts w:ascii="Times New Roman" w:hAnsi="Times New Roman" w:cs="Times New Roman"/>
+          <w:color w:val="000000" w:themeColor="text1"/>
+        </w:rPr>
+      </w:pPr>
+    </w:p>
+    <w:p>
+      <w:pPr>
+        <w:rPr>
+          <w:rFonts w:ascii="Times New Roman" w:hAnsi="Times New Roman" w:cs="Times New Roman"/>
+          <w:color w:val="000000" w:themeColor="text1"/>
+        </w:rPr>
+      </w:pPr>
+    </w:p>
+    <w:p>
+      <w:pPr>
+        <w:rPr>
+          <w:rFonts w:ascii="Times New Roman" w:hAnsi="Times New Roman" w:cs="Times New Roman"/>
+          <w:color w:val="000000" w:themeColor="text1"/>
+        </w:rPr>
+      </w:pPr>
+    </w:p>
+    <w:p>
+      <w:pPr>
+        <w:rPr>
+          <w:rFonts w:ascii="Times New Roman" w:hAnsi="Times New Roman" w:cs="Times New Roman"/>
+          <w:color w:val="000000" w:themeColor="text1"/>
+        </w:rPr>
+      </w:pPr>
+    </w:p>
+    <w:p>
+      <w:pPr>
+        <w:rPr>
+          <w:rFonts w:ascii="Times New Roman" w:hAnsi="Times New Roman" w:cs="Times New Roman"/>
+          <w:color w:val="000000" w:themeColor="text1"/>
+        </w:rPr>
+      </w:pPr>
+    </w:p>
     <w:p>
       <w:pPr>
         <w:pStyle w:val="Ttulo2"/>
         <w:jc w:val="center"/>
         <w:rPr>
-          <w:b/>
-          <w:bCs/>
-        </w:rPr>
-      </w:pPr>
-      <w:r>
-        <w:rPr>
-          <w:b/>
-          <w:bCs/>
+          <w:rFonts w:ascii="Times New Roman" w:hAnsi="Times New Roman" w:cs="Times New Roman"/>
+          <w:b/>
+          <w:bCs/>
+          <w:color w:val="000000" w:themeColor="text1"/>
+        </w:rPr>
+      </w:pPr>
+      <w:r>
+        <w:rPr>
+          <w:rFonts w:ascii="Times New Roman" w:hAnsi="Times New Roman" w:cs="Times New Roman"/>
+          <w:b/>
+          <w:bCs/>
+          <w:color w:val="000000" w:themeColor="text1"/>
         </w:rPr>
         <w:lastRenderedPageBreak/>
         <w:t>5. Referencias Bibliográficas</w:t>
       </w:r>
     </w:p>
-    <w:p/>
+    <w:p>
+      <w:pPr>
+        <w:rPr>
+          <w:rFonts w:ascii="Times New Roman" w:hAnsi="Times New Roman" w:cs="Times New Roman"/>
+          <w:color w:val="000000" w:themeColor="text1"/>
+        </w:rPr>
+      </w:pPr>
+    </w:p>
     <w:p>
       <w:pPr>
         <w:numPr>
           <w:ilvl w:val="0"/>
           <w:numId w:val="11"/>
         </w:numPr>
-      </w:pPr>
-      <w:r>
+        <w:rPr>
+          <w:rFonts w:ascii="Times New Roman" w:hAnsi="Times New Roman" w:cs="Times New Roman"/>
+          <w:color w:val="000000" w:themeColor="text1"/>
+        </w:rPr>
+      </w:pPr>
+      <w:r>
+        <w:rPr>
+          <w:rFonts w:ascii="Times New Roman" w:hAnsi="Times New Roman" w:cs="Times New Roman"/>
+          <w:color w:val="000000" w:themeColor="text1"/>
+        </w:rPr>
         <w:t xml:space="preserve">Congreso de la República de Colombia. (2012). </w:t>
       </w:r>
       <w:r>
         <w:rPr>
+          <w:rFonts w:ascii="Times New Roman" w:hAnsi="Times New Roman" w:cs="Times New Roman"/>
           <w:i/>
           <w:iCs/>
+          <w:color w:val="000000" w:themeColor="text1"/>
         </w:rPr>
         <w:t>Ley 1562 de 2012: Por la cual se modifica el Sistema de Riesgos Laborales y se dictan otras disposiciones en materia de Salud Ocupacional</w:t>
       </w:r>
       <w:r>
+        <w:rPr>
+          <w:rFonts w:ascii="Times New Roman" w:hAnsi="Times New Roman" w:cs="Times New Roman"/>
+          <w:color w:val="000000" w:themeColor="text1"/>
+        </w:rPr>
         <w:t>.</w:t>
       </w:r>
     </w:p>
@@ -1494,18 +2727,32 @@
           <w:ilvl w:val="0"/>
           <w:numId w:val="11"/>
         </w:numPr>
-      </w:pPr>
-      <w:r>
+        <w:rPr>
+          <w:rFonts w:ascii="Times New Roman" w:hAnsi="Times New Roman" w:cs="Times New Roman"/>
+          <w:color w:val="000000" w:themeColor="text1"/>
+        </w:rPr>
+      </w:pPr>
+      <w:r>
+        <w:rPr>
+          <w:rFonts w:ascii="Times New Roman" w:hAnsi="Times New Roman" w:cs="Times New Roman"/>
+          <w:color w:val="000000" w:themeColor="text1"/>
+        </w:rPr>
         <w:t xml:space="preserve">Ministerio del Trabajo. (2015). </w:t>
       </w:r>
       <w:r>
         <w:rPr>
+          <w:rFonts w:ascii="Times New Roman" w:hAnsi="Times New Roman" w:cs="Times New Roman"/>
           <w:i/>
           <w:iCs/>
+          <w:color w:val="000000" w:themeColor="text1"/>
         </w:rPr>
         <w:t>Decreto 1072 de 2015: Decreto Único Reglamentario del Sector Trabajo</w:t>
       </w:r>
       <w:r>
+        <w:rPr>
+          <w:rFonts w:ascii="Times New Roman" w:hAnsi="Times New Roman" w:cs="Times New Roman"/>
+          <w:color w:val="000000" w:themeColor="text1"/>
+        </w:rPr>
         <w:t>.</w:t>
       </w:r>
     </w:p>
@@ -1515,18 +2762,32 @@
           <w:ilvl w:val="0"/>
           <w:numId w:val="11"/>
         </w:numPr>
-      </w:pPr>
-      <w:r>
+        <w:rPr>
+          <w:rFonts w:ascii="Times New Roman" w:hAnsi="Times New Roman" w:cs="Times New Roman"/>
+          <w:color w:val="000000" w:themeColor="text1"/>
+        </w:rPr>
+      </w:pPr>
+      <w:r>
+        <w:rPr>
+          <w:rFonts w:ascii="Times New Roman" w:hAnsi="Times New Roman" w:cs="Times New Roman"/>
+          <w:color w:val="000000" w:themeColor="text1"/>
+        </w:rPr>
         <w:t xml:space="preserve">Instituto Colombiano de Normas Técnicas y Certificación (ICONTEC). (2012). </w:t>
       </w:r>
       <w:r>
         <w:rPr>
+          <w:rFonts w:ascii="Times New Roman" w:hAnsi="Times New Roman" w:cs="Times New Roman"/>
           <w:i/>
           <w:iCs/>
+          <w:color w:val="000000" w:themeColor="text1"/>
         </w:rPr>
         <w:t>Guía Técnica Colombiana GTC 45: Guía para la identificación de los peligros y la valoración de los riesgos en seguridad y salud ocupacional</w:t>
       </w:r>
       <w:r>
+        <w:rPr>
+          <w:rFonts w:ascii="Times New Roman" w:hAnsi="Times New Roman" w:cs="Times New Roman"/>
+          <w:color w:val="000000" w:themeColor="text1"/>
+        </w:rPr>
         <w:t>.</w:t>
       </w:r>
     </w:p>
@@ -1536,18 +2797,32 @@
           <w:ilvl w:val="0"/>
           <w:numId w:val="11"/>
         </w:numPr>
-      </w:pPr>
-      <w:r>
+        <w:rPr>
+          <w:rFonts w:ascii="Times New Roman" w:hAnsi="Times New Roman" w:cs="Times New Roman"/>
+          <w:color w:val="000000" w:themeColor="text1"/>
+        </w:rPr>
+      </w:pPr>
+      <w:r>
+        <w:rPr>
+          <w:rFonts w:ascii="Times New Roman" w:hAnsi="Times New Roman" w:cs="Times New Roman"/>
+          <w:color w:val="000000" w:themeColor="text1"/>
+        </w:rPr>
         <w:t xml:space="preserve">Ministerio de Trabajo y Previsión Social. (1979). </w:t>
       </w:r>
       <w:r>
         <w:rPr>
+          <w:rFonts w:ascii="Times New Roman" w:hAnsi="Times New Roman" w:cs="Times New Roman"/>
           <w:i/>
           <w:iCs/>
+          <w:color w:val="000000" w:themeColor="text1"/>
         </w:rPr>
         <w:t>Resolución 2400 de 1979: Estatuto de Higiene y Seguridad Industrial</w:t>
       </w:r>
       <w:r>
+        <w:rPr>
+          <w:rFonts w:ascii="Times New Roman" w:hAnsi="Times New Roman" w:cs="Times New Roman"/>
+          <w:color w:val="000000" w:themeColor="text1"/>
+        </w:rPr>
         <w:t>.</w:t>
       </w:r>
     </w:p>
@@ -1557,120 +2832,162 @@
           <w:ilvl w:val="0"/>
           <w:numId w:val="11"/>
         </w:numPr>
-      </w:pPr>
-      <w:r>
+        <w:rPr>
+          <w:rFonts w:ascii="Times New Roman" w:hAnsi="Times New Roman" w:cs="Times New Roman"/>
+          <w:color w:val="000000" w:themeColor="text1"/>
+        </w:rPr>
+      </w:pPr>
+      <w:r>
+        <w:rPr>
+          <w:rFonts w:ascii="Times New Roman" w:hAnsi="Times New Roman" w:cs="Times New Roman"/>
+          <w:color w:val="000000" w:themeColor="text1"/>
+        </w:rPr>
         <w:t xml:space="preserve">Bert P. Ogden Law Office. (s. f.). </w:t>
       </w:r>
-      <w:r>
-        <w:rPr>
+      <w:proofErr w:type="gramStart"/>
+      <w:r>
+        <w:rPr>
+          <w:rFonts w:ascii="Times New Roman" w:hAnsi="Times New Roman" w:cs="Times New Roman"/>
           <w:i/>
           <w:iCs/>
+          <w:color w:val="000000" w:themeColor="text1"/>
         </w:rPr>
         <w:t xml:space="preserve">Can </w:t>
       </w:r>
       <w:proofErr w:type="spellStart"/>
       <w:r>
         <w:rPr>
+          <w:rFonts w:ascii="Times New Roman" w:hAnsi="Times New Roman" w:cs="Times New Roman"/>
           <w:i/>
           <w:iCs/>
+          <w:color w:val="000000" w:themeColor="text1"/>
         </w:rPr>
         <w:t>you</w:t>
       </w:r>
       <w:proofErr w:type="spellEnd"/>
       <w:r>
         <w:rPr>
+          <w:rFonts w:ascii="Times New Roman" w:hAnsi="Times New Roman" w:cs="Times New Roman"/>
           <w:i/>
           <w:iCs/>
+          <w:color w:val="000000" w:themeColor="text1"/>
         </w:rPr>
         <w:t xml:space="preserve"> die </w:t>
       </w:r>
       <w:proofErr w:type="spellStart"/>
       <w:r>
         <w:rPr>
+          <w:rFonts w:ascii="Times New Roman" w:hAnsi="Times New Roman" w:cs="Times New Roman"/>
           <w:i/>
           <w:iCs/>
+          <w:color w:val="000000" w:themeColor="text1"/>
         </w:rPr>
         <w:t>from</w:t>
       </w:r>
       <w:proofErr w:type="spellEnd"/>
       <w:r>
         <w:rPr>
+          <w:rFonts w:ascii="Times New Roman" w:hAnsi="Times New Roman" w:cs="Times New Roman"/>
           <w:i/>
           <w:iCs/>
+          <w:color w:val="000000" w:themeColor="text1"/>
         </w:rPr>
         <w:t xml:space="preserve"> </w:t>
       </w:r>
       <w:proofErr w:type="spellStart"/>
       <w:r>
         <w:rPr>
+          <w:rFonts w:ascii="Times New Roman" w:hAnsi="Times New Roman" w:cs="Times New Roman"/>
           <w:i/>
           <w:iCs/>
+          <w:color w:val="000000" w:themeColor="text1"/>
         </w:rPr>
         <w:t>falling</w:t>
       </w:r>
       <w:proofErr w:type="spellEnd"/>
       <w:r>
         <w:rPr>
+          <w:rFonts w:ascii="Times New Roman" w:hAnsi="Times New Roman" w:cs="Times New Roman"/>
           <w:i/>
           <w:iCs/>
+          <w:color w:val="000000" w:themeColor="text1"/>
         </w:rPr>
         <w:t xml:space="preserve"> </w:t>
       </w:r>
       <w:proofErr w:type="spellStart"/>
       <w:r>
         <w:rPr>
+          <w:rFonts w:ascii="Times New Roman" w:hAnsi="Times New Roman" w:cs="Times New Roman"/>
           <w:i/>
           <w:iCs/>
+          <w:color w:val="000000" w:themeColor="text1"/>
         </w:rPr>
         <w:t>down</w:t>
       </w:r>
       <w:proofErr w:type="spellEnd"/>
       <w:r>
         <w:rPr>
+          <w:rFonts w:ascii="Times New Roman" w:hAnsi="Times New Roman" w:cs="Times New Roman"/>
           <w:i/>
           <w:iCs/>
+          <w:color w:val="000000" w:themeColor="text1"/>
         </w:rPr>
         <w:t xml:space="preserve"> </w:t>
       </w:r>
       <w:proofErr w:type="spellStart"/>
       <w:r>
         <w:rPr>
+          <w:rFonts w:ascii="Times New Roman" w:hAnsi="Times New Roman" w:cs="Times New Roman"/>
           <w:i/>
           <w:iCs/>
+          <w:color w:val="000000" w:themeColor="text1"/>
         </w:rPr>
         <w:t>the</w:t>
       </w:r>
       <w:proofErr w:type="spellEnd"/>
       <w:r>
         <w:rPr>
+          <w:rFonts w:ascii="Times New Roman" w:hAnsi="Times New Roman" w:cs="Times New Roman"/>
           <w:i/>
           <w:iCs/>
+          <w:color w:val="000000" w:themeColor="text1"/>
         </w:rPr>
         <w:t xml:space="preserve"> </w:t>
       </w:r>
       <w:proofErr w:type="spellStart"/>
       <w:r>
         <w:rPr>
+          <w:rFonts w:ascii="Times New Roman" w:hAnsi="Times New Roman" w:cs="Times New Roman"/>
           <w:i/>
           <w:iCs/>
+          <w:color w:val="000000" w:themeColor="text1"/>
         </w:rPr>
         <w:t>stairs</w:t>
       </w:r>
       <w:proofErr w:type="spellEnd"/>
       <w:r>
         <w:rPr>
+          <w:rFonts w:ascii="Times New Roman" w:hAnsi="Times New Roman" w:cs="Times New Roman"/>
           <w:i/>
           <w:iCs/>
+          <w:color w:val="000000" w:themeColor="text1"/>
         </w:rPr>
         <w:t>?</w:t>
       </w:r>
-      <w:r>
+      <w:proofErr w:type="gramEnd"/>
+      <w:r>
+        <w:rPr>
+          <w:rFonts w:ascii="Times New Roman" w:hAnsi="Times New Roman" w:cs="Times New Roman"/>
+          <w:color w:val="000000" w:themeColor="text1"/>
+        </w:rPr>
         <w:t xml:space="preserve"> Hurt Call Bert Blog. Recuperado de </w:t>
       </w:r>
       <w:hyperlink r:id="rId7" w:tgtFrame="_blank" w:history="1">
         <w:r>
           <w:rPr>
             <w:rStyle w:val="Hipervnculo"/>
+            <w:rFonts w:ascii="Times New Roman" w:hAnsi="Times New Roman" w:cs="Times New Roman"/>
+            <w:color w:val="000000" w:themeColor="text1"/>
           </w:rPr>
           <w:t>https://www.hurtcallbert.com/blog/can-you-die-from-falling-down-the-stairs/</w:t>
         </w:r>

</xml_diff>